<commit_message>
feat(demo): demo mode + QR generator for poster
V4.9 — โหมดทดลองสำหรับงานประกวด

- URL ?demo=1 → ข้าม login + ใช้ teacher seed อัตโนมัติ
- Skip Supabase init (ข้อมูลแค่ในเครื่อง ไม่กระทบ DB จริง)
- Seed 30 วันย้อนหลัง ~200 บิล + 1 pending request
- แถบสีส้ม "🎭 โหมดทดลอง" ค้างบนสุด แตะเพื่อ reload reset
- กัน localStorage.coopUser ใน demo mode
- demo-qr.html: หน้า generate QR สำหรับใส่โปสเตอร์ (auto-detect URL)

ติดโปสเตอร์: เปิด yourapp.vercel.app/demo-qr.html → ดาวน์โหลด QR

Co-Authored-By: Claude Sonnet 4.6 <noreply@anthropic.com>
</commit_message>
<xml_diff>
--- a/ประกวด/หนังสือเข้าร่วมการประกวด.docx
+++ b/ประกวด/หนังสือเข้าร่วมการประกวด.docx
@@ -1238,15 +1238,29 @@
           <w:szCs w:val="32"/>
         </w:rPr>
       </w:pPr>
-      <w:r>
-        <w:rPr>
-          <w:rFonts w:ascii="TH SarabunPSK" w:hAnsi="TH SarabunPSK" w:cs="TH SarabunPSK" w:hint="cs"/>
-          <w:b/>
-          <w:bCs/>
-          <w:sz w:val="32"/>
-          <w:szCs w:val="32"/>
-          <w:cs/>
-        </w:rPr>
+    </w:p>
+    <w:p>
+      <w:pPr>
+        <w:pStyle w:val="NoSpacing"/>
+        <w:jc w:val="center"/>
+        <w:rPr>
+          <w:rFonts w:ascii="TH SarabunPSK" w:hAnsi="TH SarabunPSK" w:cs="TH SarabunPSK"/>
+          <w:b/>
+          <w:bCs/>
+          <w:sz w:val="32"/>
+          <w:szCs w:val="32"/>
+        </w:rPr>
+      </w:pPr>
+      <w:r>
+        <w:rPr>
+          <w:rFonts w:ascii="TH SarabunPSK" w:hAnsi="TH SarabunPSK" w:cs="TH SarabunPSK" w:hint="cs"/>
+          <w:b/>
+          <w:bCs/>
+          <w:sz w:val="32"/>
+          <w:szCs w:val="32"/>
+          <w:cs/>
+        </w:rPr>
+        <w:lastRenderedPageBreak/>
         <w:t>งาน</w:t>
       </w:r>
       <w:r>
@@ -1301,7 +1315,6 @@
           <w:szCs w:val="32"/>
           <w:cs/>
         </w:rPr>
-        <w:lastRenderedPageBreak/>
         <w:t>หลักสูตรศึกษา</w:t>
       </w:r>
       <w:proofErr w:type="spellStart"/>
@@ -2410,6 +2423,19 @@
         <w:jc w:val="both"/>
         <w:rPr>
           <w:rFonts w:ascii="TH SarabunPSK" w:hAnsi="TH SarabunPSK" w:cs="TH SarabunPSK"/>
+          <w:b/>
+          <w:bCs/>
+          <w:sz w:val="32"/>
+          <w:szCs w:val="32"/>
+        </w:rPr>
+      </w:pPr>
+    </w:p>
+    <w:p>
+      <w:pPr>
+        <w:spacing w:after="200" w:line="276" w:lineRule="auto"/>
+        <w:jc w:val="both"/>
+        <w:rPr>
+          <w:rFonts w:ascii="TH SarabunPSK" w:hAnsi="TH SarabunPSK" w:cs="TH SarabunPSK"/>
           <w:szCs w:val="32"/>
         </w:rPr>
       </w:pPr>
@@ -2466,7 +2492,6 @@
           <w:sz w:val="32"/>
           <w:szCs w:val="32"/>
         </w:rPr>
-        <w:lastRenderedPageBreak/>
         <w:t xml:space="preserve">1. </w:t>
       </w:r>
       <w:r>
@@ -2745,6 +2770,7 @@
           <w:szCs w:val="32"/>
           <w:cs/>
         </w:rPr>
+        <w:lastRenderedPageBreak/>
         <w:t>ดังนั้น การพัฒนานวัตกรรมระบบสหกรณ์โรงเรียนดิจิทัลจึงมีความสำคัญอย่างยิ่งในการยกระดับคุณภาพผู้เรียนและเป็นต้นแบบของการจัดการเรียนรู้ที่เชื่อมโยงระหว่างความรู้ในห้องเรียนกับการนำไปใช้ในชีวิตจริงได้อย่างเป็นรูปธรรม</w:t>
       </w:r>
     </w:p>
@@ -2768,7 +2794,6 @@
           <w:szCs w:val="32"/>
           <w:cs/>
         </w:rPr>
-        <w:lastRenderedPageBreak/>
         <w:tab/>
       </w:r>
       <w:r>
@@ -2949,16 +2974,6 @@
         </w:rPr>
         <w:t>การมีส่วนร่วมของผู้เรียนในการดำเนินงานสหกรณ์โรงเรียนผ่านกระบวนการเรียนรู้เชิงปฏิบัติ</w:t>
       </w:r>
-    </w:p>
-    <w:p>
-      <w:pPr>
-        <w:pStyle w:val="NoSpacing"/>
-        <w:rPr>
-          <w:rFonts w:ascii="TH SarabunPSK" w:hAnsi="TH SarabunPSK" w:cs="TH SarabunPSK"/>
-          <w:sz w:val="32"/>
-          <w:szCs w:val="32"/>
-        </w:rPr>
-      </w:pPr>
     </w:p>
     <w:p>
       <w:pPr>
@@ -3308,6 +3323,7 @@
           <w:szCs w:val="32"/>
           <w:cs/>
         </w:rPr>
+        <w:lastRenderedPageBreak/>
         <w:t>กำหนดเป้าหมายของนวัตกรรมให้สอดคล้องกับปัญหาและความต้องการ</w:t>
       </w:r>
     </w:p>
@@ -3373,7 +3389,6 @@
           <w:szCs w:val="32"/>
           <w:cs/>
         </w:rPr>
-        <w:lastRenderedPageBreak/>
         <w:t>วางแผนและออกแบบนวัตกรรมให้สอดคล้องกับเป้าหมายที่กำหนด โดยมีรายละเอียดดังนี้</w:t>
       </w:r>
     </w:p>
@@ -3495,40 +3510,6 @@
           <w:szCs w:val="32"/>
           <w:cs/>
         </w:rPr>
-        <w:t>ออกแบบกิจกรรมการเรียนรู้ที่เน้นการมีส่วนร่วมของผู้เรียน (</w:t>
-      </w:r>
-      <w:r>
-        <w:rPr>
-          <w:rFonts w:ascii="TH SarabunPSK" w:hAnsi="TH SarabunPSK" w:cs="TH SarabunPSK"/>
-          <w:sz w:val="32"/>
-          <w:szCs w:val="32"/>
-        </w:rPr>
-        <w:t xml:space="preserve">Active Learning) </w:t>
-      </w:r>
-    </w:p>
-    <w:p>
-      <w:pPr>
-        <w:numPr>
-          <w:ilvl w:val="0"/>
-          <w:numId w:val="4"/>
-        </w:numPr>
-        <w:tabs>
-          <w:tab w:val="num" w:pos="720"/>
-        </w:tabs>
-        <w:spacing w:after="0" w:line="276" w:lineRule="auto"/>
-        <w:rPr>
-          <w:rFonts w:ascii="TH SarabunPSK" w:hAnsi="TH SarabunPSK" w:cs="TH SarabunPSK"/>
-          <w:sz w:val="32"/>
-          <w:szCs w:val="32"/>
-        </w:rPr>
-      </w:pPr>
-      <w:r>
-        <w:rPr>
-          <w:rFonts w:ascii="TH SarabunPSK" w:hAnsi="TH SarabunPSK" w:cs="TH SarabunPSK"/>
-          <w:sz w:val="32"/>
-          <w:szCs w:val="32"/>
-          <w:cs/>
-        </w:rPr>
         <w:t>วางแผนวิธีการเก็บข้อมูลและเครื่องมือในการประเมินผล เช่น แบบประเมินพฤติกรรม</w:t>
       </w:r>
       <w:r>
@@ -3547,49 +3528,6 @@
           <w:cs/>
         </w:rPr>
         <w:t>แบบประเมินความพึงพอใจต่อระบบสหกรณ์โรงเรียน</w:t>
-      </w:r>
-    </w:p>
-    <w:p>
-      <w:pPr>
-        <w:numPr>
-          <w:ilvl w:val="0"/>
-          <w:numId w:val="4"/>
-        </w:numPr>
-        <w:tabs>
-          <w:tab w:val="num" w:pos="720"/>
-        </w:tabs>
-        <w:spacing w:after="200" w:line="276" w:lineRule="auto"/>
-        <w:rPr>
-          <w:rFonts w:ascii="TH SarabunPSK" w:hAnsi="TH SarabunPSK" w:cs="TH SarabunPSK"/>
-          <w:sz w:val="32"/>
-          <w:szCs w:val="32"/>
-        </w:rPr>
-      </w:pPr>
-      <w:r>
-        <w:rPr>
-          <w:rFonts w:ascii="TH SarabunPSK" w:hAnsi="TH SarabunPSK" w:cs="TH SarabunPSK"/>
-          <w:sz w:val="32"/>
-          <w:szCs w:val="32"/>
-          <w:cs/>
-        </w:rPr>
-        <w:t>กำหนดตัวชี้วัดความสำเร็จ (</w:t>
-      </w:r>
-      <w:r>
-        <w:rPr>
-          <w:rFonts w:ascii="TH SarabunPSK" w:hAnsi="TH SarabunPSK" w:cs="TH SarabunPSK"/>
-          <w:sz w:val="32"/>
-          <w:szCs w:val="32"/>
-        </w:rPr>
-        <w:t xml:space="preserve">KPI) </w:t>
-      </w:r>
-      <w:r>
-        <w:rPr>
-          <w:rFonts w:ascii="TH SarabunPSK" w:hAnsi="TH SarabunPSK" w:cs="TH SarabunPSK"/>
-          <w:sz w:val="32"/>
-          <w:szCs w:val="32"/>
-          <w:cs/>
-        </w:rPr>
-        <w:t>ให้สามารถวัดผลได้อย่างชัดเจน</w:t>
       </w:r>
     </w:p>
     <w:p>
@@ -3724,7 +3662,7 @@
           <w:szCs w:val="32"/>
           <w:cs/>
         </w:rPr>
-        <w:t>จัดทำฐานข้อมูล เช่น ข้อมูลสมาชิก ข้อมูลธุรกรรม และข้อมูล</w:t>
+        <w:t>จัดทำฐานข้อมูล เช่น ข้อมูลสมาชิก และข้อมูล</w:t>
       </w:r>
       <w:r>
         <w:rPr>
@@ -3734,57 +3672,6 @@
           <w:cs/>
         </w:rPr>
         <w:t>หุ้น เป็นต้น</w:t>
-      </w:r>
-      <w:r>
-        <w:rPr>
-          <w:rFonts w:ascii="TH SarabunPSK" w:hAnsi="TH SarabunPSK" w:cs="TH SarabunPSK"/>
-          <w:sz w:val="32"/>
-          <w:szCs w:val="32"/>
-        </w:rPr>
-        <w:t xml:space="preserve"> </w:t>
-      </w:r>
-    </w:p>
-    <w:p>
-      <w:pPr>
-        <w:numPr>
-          <w:ilvl w:val="0"/>
-          <w:numId w:val="5"/>
-        </w:numPr>
-        <w:tabs>
-          <w:tab w:val="num" w:pos="720"/>
-        </w:tabs>
-        <w:spacing w:after="0" w:line="276" w:lineRule="auto"/>
-        <w:rPr>
-          <w:rFonts w:ascii="TH SarabunPSK" w:hAnsi="TH SarabunPSK" w:cs="TH SarabunPSK"/>
-          <w:sz w:val="32"/>
-          <w:szCs w:val="32"/>
-        </w:rPr>
-      </w:pPr>
-      <w:r>
-        <w:rPr>
-          <w:rFonts w:ascii="TH SarabunPSK" w:hAnsi="TH SarabunPSK" w:cs="TH SarabunPSK"/>
-          <w:sz w:val="32"/>
-          <w:szCs w:val="32"/>
-          <w:cs/>
-        </w:rPr>
-        <w:t>ทดสอบระบบในรูปแบบทดลองใช้ (</w:t>
-      </w:r>
-      <w:r>
-        <w:rPr>
-          <w:rFonts w:ascii="TH SarabunPSK" w:hAnsi="TH SarabunPSK" w:cs="TH SarabunPSK"/>
-          <w:sz w:val="32"/>
-          <w:szCs w:val="32"/>
-        </w:rPr>
-        <w:t xml:space="preserve">Try-out) </w:t>
-      </w:r>
-      <w:r>
-        <w:rPr>
-          <w:rFonts w:ascii="TH SarabunPSK" w:hAnsi="TH SarabunPSK" w:cs="TH SarabunPSK"/>
-          <w:sz w:val="32"/>
-          <w:szCs w:val="32"/>
-          <w:cs/>
-        </w:rPr>
-        <w:t>กับกลุ่มตัวอย่าง</w:t>
       </w:r>
       <w:r>
         <w:rPr>
@@ -4148,7 +4035,6 @@
           <w:szCs w:val="32"/>
           <w:cs/>
         </w:rPr>
-        <w:lastRenderedPageBreak/>
         <w:t>ประเมินพฤติกรรมของผู้เรียน เช่น วินัยทางการเงิน การมีส่วนร่วม</w:t>
       </w:r>
       <w:r>
@@ -4192,6 +4078,7 @@
           <w:szCs w:val="32"/>
           <w:cs/>
         </w:rPr>
+        <w:lastRenderedPageBreak/>
         <w:t>ประเมินทักษะผู้เรียน เช่น ทักษะดิจิทัล การคิดวิเคราะห์ และการแก้ปัญหา</w:t>
       </w:r>
       <w:r>
@@ -4628,6 +4515,34 @@
           <w:szCs w:val="32"/>
         </w:rPr>
       </w:pPr>
+    </w:p>
+    <w:p>
+      <w:pPr>
+        <w:spacing w:after="0"/>
+        <w:ind w:left="720" w:firstLine="720"/>
+        <w:jc w:val="thaiDistribute"/>
+        <w:rPr>
+          <w:rFonts w:ascii="TH SarabunPSK" w:hAnsi="TH SarabunPSK" w:cs="TH SarabunPSK"/>
+          <w:b/>
+          <w:bCs/>
+          <w:sz w:val="32"/>
+          <w:szCs w:val="32"/>
+        </w:rPr>
+      </w:pPr>
+    </w:p>
+    <w:p>
+      <w:pPr>
+        <w:spacing w:after="0"/>
+        <w:ind w:left="720" w:firstLine="720"/>
+        <w:jc w:val="thaiDistribute"/>
+        <w:rPr>
+          <w:rFonts w:ascii="TH SarabunPSK" w:hAnsi="TH SarabunPSK" w:cs="TH SarabunPSK"/>
+          <w:b/>
+          <w:bCs/>
+          <w:sz w:val="32"/>
+          <w:szCs w:val="32"/>
+        </w:rPr>
+      </w:pPr>
       <w:r>
         <w:rPr>
           <w:rFonts w:ascii="TH SarabunPSK" w:hAnsi="TH SarabunPSK" w:cs="TH SarabunPSK"/>
@@ -4677,7 +4592,7 @@
         <w:ind w:left="1440" w:firstLine="720"/>
         <w:jc w:val="thaiDistribute"/>
         <w:rPr>
-          <w:rFonts w:ascii="TH SarabunPSK" w:hAnsi="TH SarabunPSK" w:cs="TH SarabunPSK"/>
+          <w:rFonts w:ascii="TH SarabunPSK" w:hAnsi="TH SarabunPSK" w:cs="TH SarabunPSK" w:hint="cs"/>
           <w:sz w:val="32"/>
           <w:szCs w:val="32"/>
         </w:rPr>
@@ -4765,6 +4680,168 @@
       </w:pPr>
       <w:r>
         <w:rPr>
+          <w:rFonts w:ascii="TH SarabunPSK" w:hAnsi="TH SarabunPSK" w:cs="TH SarabunPSK" w:hint="cs"/>
+          <w:noProof/>
+          <w:sz w:val="32"/>
+          <w:szCs w:val="32"/>
+        </w:rPr>
+        <w:drawing>
+          <wp:anchor distT="0" distB="0" distL="114300" distR="114300" simplePos="0" relativeHeight="251664384" behindDoc="0" locked="0" layoutInCell="1" allowOverlap="1" wp14:anchorId="7EFDF227" wp14:editId="4B5A40E0">
+            <wp:simplePos x="0" y="0"/>
+            <wp:positionH relativeFrom="column">
+              <wp:posOffset>3505200</wp:posOffset>
+            </wp:positionH>
+            <wp:positionV relativeFrom="paragraph">
+              <wp:posOffset>1160326</wp:posOffset>
+            </wp:positionV>
+            <wp:extent cx="2492829" cy="1784550"/>
+            <wp:effectExtent l="19050" t="19050" r="22225" b="25400"/>
+            <wp:wrapNone/>
+            <wp:docPr id="516158134" name="Picture 1"/>
+            <wp:cNvGraphicFramePr>
+              <a:graphicFrameLocks xmlns:a="http://schemas.openxmlformats.org/drawingml/2006/main" noChangeAspect="1"/>
+            </wp:cNvGraphicFramePr>
+            <a:graphic xmlns:a="http://schemas.openxmlformats.org/drawingml/2006/main">
+              <a:graphicData uri="http://schemas.openxmlformats.org/drawingml/2006/picture">
+                <pic:pic xmlns:pic="http://schemas.openxmlformats.org/drawingml/2006/picture">
+                  <pic:nvPicPr>
+                    <pic:cNvPr id="516158134" name="Picture 1"/>
+                    <pic:cNvPicPr/>
+                  </pic:nvPicPr>
+                  <pic:blipFill rotWithShape="1">
+                    <a:blip r:embed="rId7" cstate="print">
+                      <a:extLst>
+                        <a:ext uri="{28A0092B-C50C-407E-A947-70E740481C1C}">
+                          <a14:useLocalDpi xmlns:a14="http://schemas.microsoft.com/office/drawing/2010/main" val="0"/>
+                        </a:ext>
+                      </a:extLst>
+                    </a:blip>
+                    <a:srcRect l="8691" r="9887"/>
+                    <a:stretch>
+                      <a:fillRect/>
+                    </a:stretch>
+                  </pic:blipFill>
+                  <pic:spPr bwMode="auto">
+                    <a:xfrm>
+                      <a:off x="0" y="0"/>
+                      <a:ext cx="2504424" cy="1792851"/>
+                    </a:xfrm>
+                    <a:prstGeom prst="roundRect">
+                      <a:avLst>
+                        <a:gd name="adj" fmla="val 8594"/>
+                      </a:avLst>
+                    </a:prstGeom>
+                    <a:solidFill>
+                      <a:srgbClr val="FFFFFF">
+                        <a:shade val="85000"/>
+                      </a:srgbClr>
+                    </a:solidFill>
+                    <a:ln w="19050">
+                      <a:solidFill>
+                        <a:schemeClr val="tx1"/>
+                      </a:solidFill>
+                    </a:ln>
+                    <a:effectLst>
+                      <a:reflection blurRad="12700" stA="38000" endPos="0" dist="5000" dir="5400000" sy="-100000" algn="bl" rotWithShape="0"/>
+                    </a:effectLst>
+                    <a:extLst>
+                      <a:ext uri="{53640926-AAD7-44D8-BBD7-CCE9431645EC}">
+                        <a14:shadowObscured xmlns:a14="http://schemas.microsoft.com/office/drawing/2010/main"/>
+                      </a:ext>
+                    </a:extLst>
+                  </pic:spPr>
+                </pic:pic>
+              </a:graphicData>
+            </a:graphic>
+            <wp14:sizeRelH relativeFrom="page">
+              <wp14:pctWidth>0</wp14:pctWidth>
+            </wp14:sizeRelH>
+            <wp14:sizeRelV relativeFrom="page">
+              <wp14:pctHeight>0</wp14:pctHeight>
+            </wp14:sizeRelV>
+          </wp:anchor>
+        </w:drawing>
+      </w:r>
+      <w:r>
+        <w:rPr>
+          <w:rFonts w:ascii="TH SarabunPSK" w:hAnsi="TH SarabunPSK" w:cs="TH SarabunPSK" w:hint="cs"/>
+          <w:noProof/>
+          <w:sz w:val="32"/>
+          <w:szCs w:val="32"/>
+        </w:rPr>
+        <w:drawing>
+          <wp:anchor distT="0" distB="0" distL="114300" distR="114300" simplePos="0" relativeHeight="251662336" behindDoc="0" locked="0" layoutInCell="1" allowOverlap="1" wp14:anchorId="6E2D7386" wp14:editId="47B12A75">
+            <wp:simplePos x="0" y="0"/>
+            <wp:positionH relativeFrom="column">
+              <wp:posOffset>936171</wp:posOffset>
+            </wp:positionH>
+            <wp:positionV relativeFrom="paragraph">
+              <wp:posOffset>1160326</wp:posOffset>
+            </wp:positionV>
+            <wp:extent cx="2380176" cy="1785258"/>
+            <wp:effectExtent l="19050" t="19050" r="20320" b="24765"/>
+            <wp:wrapNone/>
+            <wp:docPr id="1660366334" name="Picture 1"/>
+            <wp:cNvGraphicFramePr>
+              <a:graphicFrameLocks xmlns:a="http://schemas.openxmlformats.org/drawingml/2006/main" noChangeAspect="1"/>
+            </wp:cNvGraphicFramePr>
+            <a:graphic xmlns:a="http://schemas.openxmlformats.org/drawingml/2006/main">
+              <a:graphicData uri="http://schemas.openxmlformats.org/drawingml/2006/picture">
+                <pic:pic xmlns:pic="http://schemas.openxmlformats.org/drawingml/2006/picture">
+                  <pic:nvPicPr>
+                    <pic:cNvPr id="1660366334" name="Picture 1660366334"/>
+                    <pic:cNvPicPr/>
+                  </pic:nvPicPr>
+                  <pic:blipFill>
+                    <a:blip r:embed="rId8" cstate="print">
+                      <a:extLst>
+                        <a:ext uri="{28A0092B-C50C-407E-A947-70E740481C1C}">
+                          <a14:useLocalDpi xmlns:a14="http://schemas.microsoft.com/office/drawing/2010/main" val="0"/>
+                        </a:ext>
+                      </a:extLst>
+                    </a:blip>
+                    <a:stretch>
+                      <a:fillRect/>
+                    </a:stretch>
+                  </pic:blipFill>
+                  <pic:spPr>
+                    <a:xfrm>
+                      <a:off x="0" y="0"/>
+                      <a:ext cx="2382125" cy="1786720"/>
+                    </a:xfrm>
+                    <a:prstGeom prst="roundRect">
+                      <a:avLst>
+                        <a:gd name="adj" fmla="val 8594"/>
+                      </a:avLst>
+                    </a:prstGeom>
+                    <a:solidFill>
+                      <a:srgbClr val="FFFFFF">
+                        <a:shade val="85000"/>
+                      </a:srgbClr>
+                    </a:solidFill>
+                    <a:ln w="19050">
+                      <a:solidFill>
+                        <a:schemeClr val="tx1"/>
+                      </a:solidFill>
+                    </a:ln>
+                    <a:effectLst>
+                      <a:reflection blurRad="12700" stA="38000" endPos="0" dist="5000" dir="5400000" sy="-100000" algn="bl" rotWithShape="0"/>
+                    </a:effectLst>
+                  </pic:spPr>
+                </pic:pic>
+              </a:graphicData>
+            </a:graphic>
+            <wp14:sizeRelH relativeFrom="page">
+              <wp14:pctWidth>0</wp14:pctWidth>
+            </wp14:sizeRelH>
+            <wp14:sizeRelV relativeFrom="page">
+              <wp14:pctHeight>0</wp14:pctHeight>
+            </wp14:sizeRelV>
+          </wp:anchor>
+        </w:drawing>
+      </w:r>
+      <w:r>
+        <w:rPr>
           <w:rFonts w:ascii="TH SarabunPSK" w:hAnsi="TH SarabunPSK" w:cs="TH SarabunPSK"/>
           <w:sz w:val="32"/>
           <w:szCs w:val="32"/>
@@ -4798,6 +4875,96 @@
         </w:rPr>
         <w:t xml:space="preserve"> จึงมีลักษณะการใช้งานที่ไม่ซับซ้อน เมนูชัดเจน และสามารถเรียนรู้ได้ด้วยตนเองโดยไม่ต้องอาศัยความรู้ด้านเทคโนโลยีขั้นสูง ส่งผลให้นักเรียนสามารถเข้าถึงนวัตกรรมได้อย่างทั่วถึง ลดความเหลื่อมล้ำด้านทักษะดิจิทัล และส่งเสริมให้เกิดการเรียนรู้อย่างอิสระ </w:t>
       </w:r>
+    </w:p>
+    <w:p>
+      <w:pPr>
+        <w:tabs>
+          <w:tab w:val="num" w:pos="720"/>
+        </w:tabs>
+        <w:spacing w:line="240" w:lineRule="auto"/>
+        <w:ind w:left="1440"/>
+        <w:jc w:val="thaiDistribute"/>
+        <w:rPr>
+          <w:rFonts w:ascii="TH SarabunPSK" w:hAnsi="TH SarabunPSK" w:cs="TH SarabunPSK"/>
+          <w:sz w:val="32"/>
+          <w:szCs w:val="32"/>
+        </w:rPr>
+      </w:pPr>
+    </w:p>
+    <w:p>
+      <w:pPr>
+        <w:tabs>
+          <w:tab w:val="num" w:pos="720"/>
+        </w:tabs>
+        <w:spacing w:line="240" w:lineRule="auto"/>
+        <w:ind w:left="1440"/>
+        <w:jc w:val="thaiDistribute"/>
+        <w:rPr>
+          <w:rFonts w:ascii="TH SarabunPSK" w:hAnsi="TH SarabunPSK" w:cs="TH SarabunPSK"/>
+          <w:sz w:val="32"/>
+          <w:szCs w:val="32"/>
+        </w:rPr>
+      </w:pPr>
+    </w:p>
+    <w:p>
+      <w:pPr>
+        <w:tabs>
+          <w:tab w:val="num" w:pos="720"/>
+        </w:tabs>
+        <w:spacing w:line="240" w:lineRule="auto"/>
+        <w:ind w:left="1440"/>
+        <w:jc w:val="thaiDistribute"/>
+        <w:rPr>
+          <w:rFonts w:ascii="TH SarabunPSK" w:hAnsi="TH SarabunPSK" w:cs="TH SarabunPSK"/>
+          <w:sz w:val="32"/>
+          <w:szCs w:val="32"/>
+        </w:rPr>
+      </w:pPr>
+    </w:p>
+    <w:p>
+      <w:pPr>
+        <w:tabs>
+          <w:tab w:val="num" w:pos="720"/>
+        </w:tabs>
+        <w:spacing w:line="240" w:lineRule="auto"/>
+        <w:ind w:left="1440"/>
+        <w:jc w:val="thaiDistribute"/>
+        <w:rPr>
+          <w:rFonts w:ascii="TH SarabunPSK" w:hAnsi="TH SarabunPSK" w:cs="TH SarabunPSK" w:hint="cs"/>
+          <w:sz w:val="32"/>
+          <w:szCs w:val="32"/>
+        </w:rPr>
+      </w:pPr>
+    </w:p>
+    <w:p>
+      <w:pPr>
+        <w:tabs>
+          <w:tab w:val="num" w:pos="720"/>
+        </w:tabs>
+        <w:spacing w:line="240" w:lineRule="auto"/>
+        <w:ind w:left="1440"/>
+        <w:jc w:val="thaiDistribute"/>
+        <w:rPr>
+          <w:rFonts w:ascii="TH SarabunPSK" w:hAnsi="TH SarabunPSK" w:cs="TH SarabunPSK"/>
+          <w:sz w:val="32"/>
+          <w:szCs w:val="32"/>
+        </w:rPr>
+      </w:pPr>
+    </w:p>
+    <w:p>
+      <w:pPr>
+        <w:tabs>
+          <w:tab w:val="num" w:pos="720"/>
+        </w:tabs>
+        <w:spacing w:line="240" w:lineRule="auto"/>
+        <w:ind w:left="1440"/>
+        <w:jc w:val="thaiDistribute"/>
+        <w:rPr>
+          <w:rFonts w:ascii="TH SarabunPSK" w:hAnsi="TH SarabunPSK" w:cs="TH SarabunPSK" w:hint="cs"/>
+          <w:sz w:val="32"/>
+          <w:szCs w:val="32"/>
+        </w:rPr>
+      </w:pPr>
     </w:p>
     <w:p>
       <w:pPr>
@@ -4963,7 +5130,7 @@
           <w:szCs w:val="32"/>
           <w:cs/>
         </w:rPr>
-        <w:t>พัฒนาระบบสหกรณ์โรงเรียนในรูปแบบดิจิทัลที่ครอบคลุมทุกกระบวนการ ตั้งแต่การสมัครสมาชิก การซื้อ–ขายสินค้า การบันทึกข้อมูลธุรกรรม ไปจนถึงการจัดเก็บข้อมูลอย่างเป็นระบบ ทำให้การดำเนินงานมีความรวดเร็ว ถูกต้อง และลดข้อผิดพลาดจากการทำงานแบบเดิมที่ใช้เอกสาร นอกจากนี้ยังช่วยให้สามารถเข้าถึงข้อมูลได้</w:t>
+        <w:t>พัฒนาระบบสหกรณ์โรงเรียนในรูปแบบดิจิทัลที่ครอบคลุมทุกกระบวนการ ตั้งแต่การซื้อ–ขายสินค้า การบันทึกข้อมูลธุรกรรม ไปจนถึงการจัดเก็บข้อมูลอย่างเป็นระบบ ทำให้การดำเนินงานมีความรวดเร็ว ถูกต้อง และลดข้อผิดพลาดจากการทำงานแบบเดิมที่ใช้เอกสาร นอกจากนี้ยังช่วยให้สามารถเข้าถึงข้อมูลได้</w:t>
       </w:r>
       <w:r>
         <w:rPr>
@@ -4983,6 +5150,303 @@
         </w:rPr>
         <w:t xml:space="preserve"> และนำข้อมูลไปใช้วิเคราะห์เพื่อพัฒนาการเรียนรู้ของผู้เรียนได้อย่างมีประสิทธิภาพ</w:t>
       </w:r>
+    </w:p>
+    <w:p>
+      <w:pPr>
+        <w:tabs>
+          <w:tab w:val="num" w:pos="720"/>
+        </w:tabs>
+        <w:spacing w:line="240" w:lineRule="auto"/>
+        <w:ind w:left="1440"/>
+        <w:jc w:val="thaiDistribute"/>
+        <w:rPr>
+          <w:rFonts w:ascii="TH SarabunPSK" w:hAnsi="TH SarabunPSK" w:cs="TH SarabunPSK"/>
+          <w:sz w:val="32"/>
+          <w:szCs w:val="32"/>
+        </w:rPr>
+      </w:pPr>
+      <w:r>
+        <w:rPr>
+          <w:rFonts w:ascii="TH SarabunPSK" w:hAnsi="TH SarabunPSK" w:cs="TH SarabunPSK" w:hint="cs"/>
+          <w:noProof/>
+          <w:sz w:val="32"/>
+          <w:szCs w:val="32"/>
+        </w:rPr>
+        <w:lastRenderedPageBreak/>
+        <w:drawing>
+          <wp:anchor distT="0" distB="0" distL="114300" distR="114300" simplePos="0" relativeHeight="251666432" behindDoc="0" locked="0" layoutInCell="1" allowOverlap="1" wp14:anchorId="18A4650E" wp14:editId="792C12E7">
+            <wp:simplePos x="0" y="0"/>
+            <wp:positionH relativeFrom="column">
+              <wp:posOffset>606879</wp:posOffset>
+            </wp:positionH>
+            <wp:positionV relativeFrom="paragraph">
+              <wp:posOffset>-144235</wp:posOffset>
+            </wp:positionV>
+            <wp:extent cx="2267585" cy="3503840"/>
+            <wp:effectExtent l="19050" t="19050" r="18415" b="20955"/>
+            <wp:wrapNone/>
+            <wp:docPr id="1540416303" name="Picture 1"/>
+            <wp:cNvGraphicFramePr>
+              <a:graphicFrameLocks xmlns:a="http://schemas.openxmlformats.org/drawingml/2006/main" noChangeAspect="1"/>
+            </wp:cNvGraphicFramePr>
+            <a:graphic xmlns:a="http://schemas.openxmlformats.org/drawingml/2006/main">
+              <a:graphicData uri="http://schemas.openxmlformats.org/drawingml/2006/picture">
+                <pic:pic xmlns:pic="http://schemas.openxmlformats.org/drawingml/2006/picture">
+                  <pic:nvPicPr>
+                    <pic:cNvPr id="1540416303" name="Picture 1"/>
+                    <pic:cNvPicPr/>
+                  </pic:nvPicPr>
+                  <pic:blipFill rotWithShape="1">
+                    <a:blip r:embed="rId9" cstate="print">
+                      <a:extLst>
+                        <a:ext uri="{28A0092B-C50C-407E-A947-70E740481C1C}">
+                          <a14:useLocalDpi xmlns:a14="http://schemas.microsoft.com/office/drawing/2010/main" val="0"/>
+                        </a:ext>
+                      </a:extLst>
+                    </a:blip>
+                    <a:srcRect t="12891" b="58"/>
+                    <a:stretch>
+                      <a:fillRect/>
+                    </a:stretch>
+                  </pic:blipFill>
+                  <pic:spPr bwMode="auto">
+                    <a:xfrm>
+                      <a:off x="0" y="0"/>
+                      <a:ext cx="2267585" cy="3503840"/>
+                    </a:xfrm>
+                    <a:prstGeom prst="roundRect">
+                      <a:avLst>
+                        <a:gd name="adj" fmla="val 8594"/>
+                      </a:avLst>
+                    </a:prstGeom>
+                    <a:solidFill>
+                      <a:srgbClr val="FFFFFF">
+                        <a:shade val="85000"/>
+                      </a:srgbClr>
+                    </a:solidFill>
+                    <a:ln w="19050" cap="flat" cmpd="sng" algn="ctr">
+                      <a:solidFill>
+                        <a:sysClr val="windowText" lastClr="000000"/>
+                      </a:solidFill>
+                      <a:prstDash val="solid"/>
+                      <a:round/>
+                      <a:headEnd type="none" w="med" len="med"/>
+                      <a:tailEnd type="none" w="med" len="med"/>
+                      <a:extLst>
+                        <a:ext uri="{C807C97D-BFC1-408E-A445-0C87EB9F89A2}">
+                          <ask:lineSketchStyleProps xmlns:ask="http://schemas.microsoft.com/office/drawing/2018/sketchyshapes" sd="0">
+                            <a:custGeom>
+                              <a:avLst/>
+                              <a:gdLst/>
+                              <a:ahLst/>
+                              <a:cxnLst/>
+                              <a:rect l="0" t="0" r="0" b="0"/>
+                              <a:pathLst/>
+                            </a:custGeom>
+                            <ask:type/>
+                          </ask:lineSketchStyleProps>
+                        </a:ext>
+                      </a:extLst>
+                    </a:ln>
+                    <a:effectLst>
+                      <a:reflection blurRad="12700" stA="38000" endPos="0" dist="5000" dir="5400000" sy="-100000" algn="bl" rotWithShape="0"/>
+                    </a:effectLst>
+                    <a:extLst>
+                      <a:ext uri="{53640926-AAD7-44D8-BBD7-CCE9431645EC}">
+                        <a14:shadowObscured xmlns:a14="http://schemas.microsoft.com/office/drawing/2010/main"/>
+                      </a:ext>
+                    </a:extLst>
+                  </pic:spPr>
+                </pic:pic>
+              </a:graphicData>
+            </a:graphic>
+            <wp14:sizeRelH relativeFrom="page">
+              <wp14:pctWidth>0</wp14:pctWidth>
+            </wp14:sizeRelH>
+            <wp14:sizeRelV relativeFrom="page">
+              <wp14:pctHeight>0</wp14:pctHeight>
+            </wp14:sizeRelV>
+          </wp:anchor>
+        </w:drawing>
+      </w:r>
+      <w:r>
+        <w:rPr>
+          <w:rFonts w:ascii="TH SarabunPSK" w:hAnsi="TH SarabunPSK" w:cs="TH SarabunPSK" w:hint="cs"/>
+          <w:noProof/>
+          <w:sz w:val="32"/>
+          <w:szCs w:val="32"/>
+        </w:rPr>
+        <w:drawing>
+          <wp:anchor distT="0" distB="0" distL="114300" distR="114300" simplePos="0" relativeHeight="251668480" behindDoc="0" locked="0" layoutInCell="1" allowOverlap="1" wp14:anchorId="508EAB79" wp14:editId="26572B7D">
+            <wp:simplePos x="0" y="0"/>
+            <wp:positionH relativeFrom="column">
+              <wp:posOffset>3349625</wp:posOffset>
+            </wp:positionH>
+            <wp:positionV relativeFrom="paragraph">
+              <wp:posOffset>-141605</wp:posOffset>
+            </wp:positionV>
+            <wp:extent cx="2267585" cy="3503930"/>
+            <wp:effectExtent l="19050" t="19050" r="18415" b="20320"/>
+            <wp:wrapNone/>
+            <wp:docPr id="2001728902" name="Picture 1"/>
+            <wp:cNvGraphicFramePr>
+              <a:graphicFrameLocks xmlns:a="http://schemas.openxmlformats.org/drawingml/2006/main" noChangeAspect="1"/>
+            </wp:cNvGraphicFramePr>
+            <a:graphic xmlns:a="http://schemas.openxmlformats.org/drawingml/2006/main">
+              <a:graphicData uri="http://schemas.openxmlformats.org/drawingml/2006/picture">
+                <pic:pic xmlns:pic="http://schemas.openxmlformats.org/drawingml/2006/picture">
+                  <pic:nvPicPr>
+                    <pic:cNvPr id="2001728902" name="Picture 1"/>
+                    <pic:cNvPicPr/>
+                  </pic:nvPicPr>
+                  <pic:blipFill rotWithShape="1">
+                    <a:blip r:embed="rId10" cstate="print">
+                      <a:extLst>
+                        <a:ext uri="{28A0092B-C50C-407E-A947-70E740481C1C}">
+                          <a14:useLocalDpi xmlns:a14="http://schemas.microsoft.com/office/drawing/2010/main" val="0"/>
+                        </a:ext>
+                      </a:extLst>
+                    </a:blip>
+                    <a:srcRect t="11770" b="6638"/>
+                    <a:stretch>
+                      <a:fillRect/>
+                    </a:stretch>
+                  </pic:blipFill>
+                  <pic:spPr bwMode="auto">
+                    <a:xfrm>
+                      <a:off x="0" y="0"/>
+                      <a:ext cx="2267585" cy="3503930"/>
+                    </a:xfrm>
+                    <a:prstGeom prst="roundRect">
+                      <a:avLst>
+                        <a:gd name="adj" fmla="val 8594"/>
+                      </a:avLst>
+                    </a:prstGeom>
+                    <a:solidFill>
+                      <a:srgbClr val="FFFFFF">
+                        <a:shade val="85000"/>
+                      </a:srgbClr>
+                    </a:solidFill>
+                    <a:ln w="19050" cap="flat" cmpd="sng" algn="ctr">
+                      <a:solidFill>
+                        <a:sysClr val="windowText" lastClr="000000"/>
+                      </a:solidFill>
+                      <a:prstDash val="solid"/>
+                      <a:round/>
+                      <a:headEnd type="none" w="med" len="med"/>
+                      <a:tailEnd type="none" w="med" len="med"/>
+                      <a:extLst>
+                        <a:ext uri="{C807C97D-BFC1-408E-A445-0C87EB9F89A2}">
+                          <ask:lineSketchStyleProps xmlns:ask="http://schemas.microsoft.com/office/drawing/2018/sketchyshapes" sd="0">
+                            <a:custGeom>
+                              <a:avLst/>
+                              <a:gdLst/>
+                              <a:ahLst/>
+                              <a:cxnLst/>
+                              <a:rect l="0" t="0" r="0" b="0"/>
+                              <a:pathLst/>
+                            </a:custGeom>
+                            <ask:type/>
+                          </ask:lineSketchStyleProps>
+                        </a:ext>
+                      </a:extLst>
+                    </a:ln>
+                    <a:effectLst>
+                      <a:reflection blurRad="12700" stA="38000" endPos="0" dist="5000" dir="5400000" sy="-100000" algn="bl" rotWithShape="0"/>
+                    </a:effectLst>
+                    <a:extLst>
+                      <a:ext uri="{53640926-AAD7-44D8-BBD7-CCE9431645EC}">
+                        <a14:shadowObscured xmlns:a14="http://schemas.microsoft.com/office/drawing/2010/main"/>
+                      </a:ext>
+                    </a:extLst>
+                  </pic:spPr>
+                </pic:pic>
+              </a:graphicData>
+            </a:graphic>
+            <wp14:sizeRelH relativeFrom="page">
+              <wp14:pctWidth>0</wp14:pctWidth>
+            </wp14:sizeRelH>
+            <wp14:sizeRelV relativeFrom="page">
+              <wp14:pctHeight>0</wp14:pctHeight>
+            </wp14:sizeRelV>
+          </wp:anchor>
+        </w:drawing>
+      </w:r>
+    </w:p>
+    <w:p>
+      <w:pPr>
+        <w:tabs>
+          <w:tab w:val="num" w:pos="720"/>
+        </w:tabs>
+        <w:spacing w:line="240" w:lineRule="auto"/>
+        <w:ind w:left="1440"/>
+        <w:jc w:val="thaiDistribute"/>
+        <w:rPr>
+          <w:rFonts w:ascii="TH SarabunPSK" w:hAnsi="TH SarabunPSK" w:cs="TH SarabunPSK"/>
+          <w:sz w:val="32"/>
+          <w:szCs w:val="32"/>
+        </w:rPr>
+      </w:pPr>
+    </w:p>
+    <w:p>
+      <w:pPr>
+        <w:tabs>
+          <w:tab w:val="num" w:pos="720"/>
+        </w:tabs>
+        <w:spacing w:line="240" w:lineRule="auto"/>
+        <w:ind w:left="1440"/>
+        <w:jc w:val="thaiDistribute"/>
+        <w:rPr>
+          <w:rFonts w:ascii="TH SarabunPSK" w:hAnsi="TH SarabunPSK" w:cs="TH SarabunPSK" w:hint="cs"/>
+          <w:sz w:val="32"/>
+          <w:szCs w:val="32"/>
+        </w:rPr>
+      </w:pPr>
+    </w:p>
+    <w:p>
+      <w:pPr>
+        <w:tabs>
+          <w:tab w:val="num" w:pos="720"/>
+        </w:tabs>
+        <w:spacing w:line="240" w:lineRule="auto"/>
+        <w:ind w:left="1440"/>
+        <w:jc w:val="thaiDistribute"/>
+        <w:rPr>
+          <w:rFonts w:ascii="TH SarabunPSK" w:hAnsi="TH SarabunPSK" w:cs="TH SarabunPSK"/>
+          <w:sz w:val="32"/>
+          <w:szCs w:val="32"/>
+        </w:rPr>
+      </w:pPr>
+    </w:p>
+    <w:p>
+      <w:pPr>
+        <w:tabs>
+          <w:tab w:val="num" w:pos="720"/>
+        </w:tabs>
+        <w:spacing w:line="240" w:lineRule="auto"/>
+        <w:ind w:left="1440"/>
+        <w:jc w:val="thaiDistribute"/>
+        <w:rPr>
+          <w:rFonts w:ascii="TH SarabunPSK" w:hAnsi="TH SarabunPSK" w:cs="TH SarabunPSK"/>
+          <w:sz w:val="32"/>
+          <w:szCs w:val="32"/>
+        </w:rPr>
+      </w:pPr>
+    </w:p>
+    <w:p>
+      <w:pPr>
+        <w:tabs>
+          <w:tab w:val="num" w:pos="720"/>
+        </w:tabs>
+        <w:spacing w:line="240" w:lineRule="auto"/>
+        <w:ind w:left="1440"/>
+        <w:jc w:val="thaiDistribute"/>
+        <w:rPr>
+          <w:rFonts w:ascii="TH SarabunPSK" w:hAnsi="TH SarabunPSK" w:cs="TH SarabunPSK" w:hint="cs"/>
+          <w:sz w:val="32"/>
+          <w:szCs w:val="32"/>
+        </w:rPr>
+      </w:pPr>
     </w:p>
     <w:p>
       <w:pPr>
@@ -5039,6 +5503,61 @@
           <w:szCs w:val="32"/>
         </w:rPr>
       </w:pPr>
+    </w:p>
+    <w:p>
+      <w:pPr>
+        <w:spacing w:after="0"/>
+        <w:ind w:left="720" w:firstLine="720"/>
+        <w:jc w:val="center"/>
+        <w:rPr>
+          <w:rFonts w:ascii="TH SarabunPSK" w:hAnsi="TH SarabunPSK" w:cs="TH SarabunPSK" w:hint="cs"/>
+          <w:sz w:val="32"/>
+          <w:szCs w:val="32"/>
+        </w:rPr>
+      </w:pPr>
+      <w:r>
+        <w:rPr>
+          <w:rFonts w:ascii="TH SarabunPSK" w:hAnsi="TH SarabunPSK" w:cs="TH SarabunPSK" w:hint="cs"/>
+          <w:sz w:val="32"/>
+          <w:szCs w:val="32"/>
+          <w:cs/>
+        </w:rPr>
+        <w:t>ตัวอย่างหน้าการซื้อ-ขายและ</w:t>
+      </w:r>
+      <w:proofErr w:type="spellStart"/>
+      <w:r>
+        <w:rPr>
+          <w:rFonts w:ascii="TH SarabunPSK" w:hAnsi="TH SarabunPSK" w:cs="TH SarabunPSK" w:hint="cs"/>
+          <w:sz w:val="32"/>
+          <w:szCs w:val="32"/>
+          <w:cs/>
+        </w:rPr>
+        <w:t>แดช</w:t>
+      </w:r>
+      <w:proofErr w:type="spellEnd"/>
+      <w:r>
+        <w:rPr>
+          <w:rFonts w:ascii="TH SarabunPSK" w:hAnsi="TH SarabunPSK" w:cs="TH SarabunPSK" w:hint="cs"/>
+          <w:sz w:val="32"/>
+          <w:szCs w:val="32"/>
+          <w:cs/>
+        </w:rPr>
+        <w:t>บอร์ดแสดงยอดขาย</w:t>
+      </w:r>
+    </w:p>
+    <w:p>
+      <w:pPr>
+        <w:spacing w:after="0"/>
+        <w:ind w:left="720" w:firstLine="720"/>
+        <w:jc w:val="thaiDistribute"/>
+        <w:rPr>
+          <w:rFonts w:ascii="TH SarabunPSK" w:hAnsi="TH SarabunPSK" w:cs="TH SarabunPSK"/>
+          <w:b/>
+          <w:bCs/>
+          <w:sz w:val="32"/>
+          <w:szCs w:val="32"/>
+        </w:rPr>
+      </w:pPr>
       <w:r>
         <w:rPr>
           <w:rFonts w:ascii="TH SarabunPSK" w:hAnsi="TH SarabunPSK" w:cs="TH SarabunPSK"/>
@@ -5083,6 +5602,90 @@
       </w:pPr>
       <w:r>
         <w:rPr>
+          <w:rFonts w:ascii="TH SarabunPSK" w:hAnsi="TH SarabunPSK" w:cs="TH SarabunPSK" w:hint="cs"/>
+          <w:noProof/>
+          <w:sz w:val="32"/>
+          <w:szCs w:val="32"/>
+        </w:rPr>
+        <w:drawing>
+          <wp:anchor distT="0" distB="0" distL="114300" distR="114300" simplePos="0" relativeHeight="251670528" behindDoc="0" locked="0" layoutInCell="1" allowOverlap="1" wp14:anchorId="10CC92AC" wp14:editId="64763835">
+            <wp:simplePos x="0" y="0"/>
+            <wp:positionH relativeFrom="column">
+              <wp:posOffset>1260748</wp:posOffset>
+            </wp:positionH>
+            <wp:positionV relativeFrom="paragraph">
+              <wp:posOffset>988060</wp:posOffset>
+            </wp:positionV>
+            <wp:extent cx="4357297" cy="2582636"/>
+            <wp:effectExtent l="19050" t="19050" r="24765" b="27305"/>
+            <wp:wrapNone/>
+            <wp:docPr id="1042889123" name="Picture 1"/>
+            <wp:cNvGraphicFramePr>
+              <a:graphicFrameLocks xmlns:a="http://schemas.openxmlformats.org/drawingml/2006/main" noChangeAspect="1"/>
+            </wp:cNvGraphicFramePr>
+            <a:graphic xmlns:a="http://schemas.openxmlformats.org/drawingml/2006/main">
+              <a:graphicData uri="http://schemas.openxmlformats.org/drawingml/2006/picture">
+                <pic:pic xmlns:pic="http://schemas.openxmlformats.org/drawingml/2006/picture">
+                  <pic:nvPicPr>
+                    <pic:cNvPr id="1042889123" name="Picture 1"/>
+                    <pic:cNvPicPr/>
+                  </pic:nvPicPr>
+                  <pic:blipFill>
+                    <a:blip r:embed="rId11" cstate="print">
+                      <a:extLst>
+                        <a:ext uri="{28A0092B-C50C-407E-A947-70E740481C1C}">
+                          <a14:useLocalDpi xmlns:a14="http://schemas.microsoft.com/office/drawing/2010/main" val="0"/>
+                        </a:ext>
+                      </a:extLst>
+                    </a:blip>
+                    <a:srcRect l="14089" r="14089"/>
+                    <a:stretch>
+                      <a:fillRect/>
+                    </a:stretch>
+                  </pic:blipFill>
+                  <pic:spPr bwMode="auto">
+                    <a:xfrm>
+                      <a:off x="0" y="0"/>
+                      <a:ext cx="4357297" cy="2582636"/>
+                    </a:xfrm>
+                    <a:prstGeom prst="roundRect">
+                      <a:avLst>
+                        <a:gd name="adj" fmla="val 8594"/>
+                      </a:avLst>
+                    </a:prstGeom>
+                    <a:solidFill>
+                      <a:srgbClr val="FFFFFF">
+                        <a:shade val="85000"/>
+                      </a:srgbClr>
+                    </a:solidFill>
+                    <a:ln w="19050">
+                      <a:solidFill>
+                        <a:schemeClr val="tx1"/>
+                      </a:solidFill>
+                    </a:ln>
+                    <a:effectLst>
+                      <a:reflection blurRad="12700" stA="38000" endPos="0" dist="5000" dir="5400000" sy="-100000" algn="bl" rotWithShape="0"/>
+                    </a:effectLst>
+                    <a:extLst>
+                      <a:ext uri="{53640926-AAD7-44D8-BBD7-CCE9431645EC}">
+                        <a14:shadowObscured xmlns:a14="http://schemas.microsoft.com/office/drawing/2010/main"/>
+                      </a:ext>
+                    </a:extLst>
+                  </pic:spPr>
+                </pic:pic>
+              </a:graphicData>
+            </a:graphic>
+            <wp14:sizeRelH relativeFrom="page">
+              <wp14:pctWidth>0</wp14:pctWidth>
+            </wp14:sizeRelH>
+            <wp14:sizeRelV relativeFrom="page">
+              <wp14:pctHeight>0</wp14:pctHeight>
+            </wp14:sizeRelV>
+          </wp:anchor>
+        </w:drawing>
+      </w:r>
+      <w:r>
+        <w:rPr>
           <w:rFonts w:ascii="TH SarabunPSK" w:hAnsi="TH SarabunPSK" w:cs="TH SarabunPSK"/>
           <w:sz w:val="32"/>
           <w:szCs w:val="32"/>
@@ -5127,26 +5730,137 @@
     </w:p>
     <w:p>
       <w:pPr>
-        <w:pStyle w:val="NoSpacing"/>
+        <w:ind w:left="1440" w:firstLine="720"/>
         <w:jc w:val="thaiDistribute"/>
         <w:rPr>
           <w:rFonts w:ascii="TH SarabunPSK" w:hAnsi="TH SarabunPSK" w:cs="TH SarabunPSK"/>
-          <w:b/>
-          <w:bCs/>
-          <w:sz w:val="32"/>
-          <w:szCs w:val="32"/>
-        </w:rPr>
-      </w:pPr>
-      <w:r>
-        <w:rPr>
-          <w:rFonts w:ascii="TH SarabunPSK" w:hAnsi="TH SarabunPSK" w:cs="TH SarabunPSK"/>
-          <w:sz w:val="32"/>
-          <w:szCs w:val="32"/>
-          <w:cs/>
-        </w:rPr>
-        <w:lastRenderedPageBreak/>
-        <w:tab/>
-      </w:r>
+          <w:szCs w:val="32"/>
+        </w:rPr>
+      </w:pPr>
+    </w:p>
+    <w:p>
+      <w:pPr>
+        <w:ind w:left="1440" w:firstLine="720"/>
+        <w:jc w:val="thaiDistribute"/>
+        <w:rPr>
+          <w:rFonts w:ascii="TH SarabunPSK" w:hAnsi="TH SarabunPSK" w:cs="TH SarabunPSK"/>
+          <w:szCs w:val="32"/>
+        </w:rPr>
+      </w:pPr>
+    </w:p>
+    <w:p>
+      <w:pPr>
+        <w:ind w:left="1440" w:firstLine="720"/>
+        <w:jc w:val="thaiDistribute"/>
+        <w:rPr>
+          <w:rFonts w:ascii="TH SarabunPSK" w:hAnsi="TH SarabunPSK" w:cs="TH SarabunPSK"/>
+          <w:szCs w:val="32"/>
+        </w:rPr>
+      </w:pPr>
+    </w:p>
+    <w:p>
+      <w:pPr>
+        <w:ind w:left="1440" w:firstLine="720"/>
+        <w:jc w:val="thaiDistribute"/>
+        <w:rPr>
+          <w:rFonts w:ascii="TH SarabunPSK" w:hAnsi="TH SarabunPSK" w:cs="TH SarabunPSK"/>
+          <w:szCs w:val="32"/>
+        </w:rPr>
+      </w:pPr>
+    </w:p>
+    <w:p>
+      <w:pPr>
+        <w:ind w:left="1440" w:firstLine="720"/>
+        <w:jc w:val="thaiDistribute"/>
+        <w:rPr>
+          <w:rFonts w:ascii="TH SarabunPSK" w:hAnsi="TH SarabunPSK" w:cs="TH SarabunPSK"/>
+          <w:szCs w:val="32"/>
+        </w:rPr>
+      </w:pPr>
+    </w:p>
+    <w:p>
+      <w:pPr>
+        <w:ind w:left="1440" w:firstLine="720"/>
+        <w:jc w:val="thaiDistribute"/>
+        <w:rPr>
+          <w:rFonts w:ascii="TH SarabunPSK" w:hAnsi="TH SarabunPSK" w:cs="TH SarabunPSK"/>
+          <w:szCs w:val="32"/>
+        </w:rPr>
+      </w:pPr>
+    </w:p>
+    <w:p>
+      <w:pPr>
+        <w:ind w:left="1440" w:firstLine="720"/>
+        <w:jc w:val="thaiDistribute"/>
+        <w:rPr>
+          <w:rFonts w:ascii="TH SarabunPSK" w:hAnsi="TH SarabunPSK" w:cs="TH SarabunPSK"/>
+          <w:szCs w:val="32"/>
+        </w:rPr>
+      </w:pPr>
+    </w:p>
+    <w:p>
+      <w:pPr>
+        <w:ind w:left="1440" w:firstLine="720"/>
+        <w:jc w:val="thaiDistribute"/>
+        <w:rPr>
+          <w:rFonts w:ascii="TH SarabunPSK" w:hAnsi="TH SarabunPSK" w:cs="TH SarabunPSK" w:hint="cs"/>
+          <w:szCs w:val="32"/>
+        </w:rPr>
+      </w:pPr>
+    </w:p>
+    <w:p>
+      <w:pPr>
+        <w:spacing w:after="0"/>
+        <w:ind w:left="720" w:firstLine="720"/>
+        <w:jc w:val="center"/>
+        <w:rPr>
+          <w:rFonts w:ascii="TH SarabunPSK" w:hAnsi="TH SarabunPSK" w:cs="TH SarabunPSK" w:hint="cs"/>
+          <w:sz w:val="32"/>
+          <w:szCs w:val="32"/>
+        </w:rPr>
+      </w:pPr>
+      <w:r>
+        <w:rPr>
+          <w:rFonts w:ascii="TH SarabunPSK" w:hAnsi="TH SarabunPSK" w:cs="TH SarabunPSK" w:hint="cs"/>
+          <w:sz w:val="32"/>
+          <w:szCs w:val="32"/>
+          <w:cs/>
+        </w:rPr>
+        <w:t>ตัวอย่างห</w:t>
+      </w:r>
+      <w:r>
+        <w:rPr>
+          <w:rFonts w:ascii="TH SarabunPSK" w:hAnsi="TH SarabunPSK" w:cs="TH SarabunPSK" w:hint="cs"/>
+          <w:sz w:val="32"/>
+          <w:szCs w:val="32"/>
+          <w:cs/>
+        </w:rPr>
+        <w:t>น้าแสดงประวัติการใช้งานของระบบ</w:t>
+      </w:r>
+    </w:p>
+    <w:p>
+      <w:pPr>
+        <w:pStyle w:val="NoSpacing"/>
+        <w:jc w:val="center"/>
+        <w:rPr>
+          <w:rFonts w:ascii="TH SarabunPSK" w:hAnsi="TH SarabunPSK" w:cs="TH SarabunPSK"/>
+          <w:sz w:val="32"/>
+          <w:szCs w:val="32"/>
+        </w:rPr>
+      </w:pPr>
+    </w:p>
+    <w:p>
+      <w:pPr>
+        <w:pStyle w:val="NoSpacing"/>
+        <w:jc w:val="thaiDistribute"/>
+        <w:rPr>
+          <w:rFonts w:ascii="TH SarabunPSK" w:hAnsi="TH SarabunPSK" w:cs="TH SarabunPSK"/>
+          <w:b/>
+          <w:bCs/>
+          <w:sz w:val="32"/>
+          <w:szCs w:val="32"/>
+        </w:rPr>
+      </w:pPr>
       <w:r>
         <w:rPr>
           <w:rFonts w:ascii="TH SarabunPSK" w:hAnsi="TH SarabunPSK" w:cs="TH SarabunPSK"/>
@@ -5499,162 +6213,6 @@
     <w:p>
       <w:pPr>
         <w:pStyle w:val="NoSpacing"/>
-        <w:rPr>
-          <w:rFonts w:ascii="TH SarabunPSK" w:hAnsi="TH SarabunPSK" w:cs="TH SarabunPSK"/>
-          <w:sz w:val="32"/>
-          <w:szCs w:val="32"/>
-        </w:rPr>
-      </w:pPr>
-    </w:p>
-    <w:p>
-      <w:pPr>
-        <w:pStyle w:val="NoSpacing"/>
-        <w:rPr>
-          <w:rFonts w:ascii="TH SarabunPSK" w:hAnsi="TH SarabunPSK" w:cs="TH SarabunPSK"/>
-          <w:sz w:val="32"/>
-          <w:szCs w:val="32"/>
-        </w:rPr>
-      </w:pPr>
-    </w:p>
-    <w:p>
-      <w:pPr>
-        <w:pStyle w:val="NoSpacing"/>
-        <w:rPr>
-          <w:rFonts w:ascii="TH SarabunPSK" w:hAnsi="TH SarabunPSK" w:cs="TH SarabunPSK"/>
-          <w:sz w:val="32"/>
-          <w:szCs w:val="32"/>
-        </w:rPr>
-      </w:pPr>
-    </w:p>
-    <w:p>
-      <w:pPr>
-        <w:pStyle w:val="NoSpacing"/>
-        <w:rPr>
-          <w:rFonts w:ascii="TH SarabunPSK" w:hAnsi="TH SarabunPSK" w:cs="TH SarabunPSK"/>
-          <w:sz w:val="32"/>
-          <w:szCs w:val="32"/>
-        </w:rPr>
-      </w:pPr>
-    </w:p>
-    <w:p>
-      <w:pPr>
-        <w:pStyle w:val="NoSpacing"/>
-        <w:rPr>
-          <w:rFonts w:ascii="TH SarabunPSK" w:hAnsi="TH SarabunPSK" w:cs="TH SarabunPSK"/>
-          <w:b/>
-          <w:bCs/>
-          <w:sz w:val="32"/>
-          <w:szCs w:val="32"/>
-        </w:rPr>
-      </w:pPr>
-      <w:r>
-        <w:rPr>
-          <w:rFonts w:ascii="TH SarabunPSK" w:hAnsi="TH SarabunPSK" w:cs="TH SarabunPSK"/>
-          <w:sz w:val="32"/>
-          <w:szCs w:val="32"/>
-          <w:cs/>
-        </w:rPr>
-        <w:tab/>
-      </w:r>
-      <w:r>
-        <w:rPr>
-          <w:rFonts w:ascii="TH SarabunPSK" w:hAnsi="TH SarabunPSK" w:cs="TH SarabunPSK"/>
-          <w:b/>
-          <w:bCs/>
-          <w:sz w:val="32"/>
-          <w:szCs w:val="32"/>
-        </w:rPr>
-        <w:t xml:space="preserve">6. </w:t>
-      </w:r>
-      <w:r>
-        <w:rPr>
-          <w:rFonts w:ascii="TH SarabunPSK" w:hAnsi="TH SarabunPSK" w:cs="TH SarabunPSK" w:hint="cs"/>
-          <w:b/>
-          <w:bCs/>
-          <w:sz w:val="32"/>
-          <w:szCs w:val="32"/>
-          <w:cs/>
-        </w:rPr>
-        <w:t>แนวทางการพัฒนาต่อยอด</w:t>
-      </w:r>
-    </w:p>
-    <w:p>
-      <w:pPr>
-        <w:pStyle w:val="NoSpacing"/>
-        <w:rPr>
-          <w:rFonts w:ascii="TH SarabunPSK" w:hAnsi="TH SarabunPSK" w:cs="TH SarabunPSK"/>
-          <w:b/>
-          <w:bCs/>
-          <w:szCs w:val="32"/>
-        </w:rPr>
-      </w:pPr>
-      <w:r>
-        <w:rPr>
-          <w:rFonts w:ascii="TH SarabunPSK" w:hAnsi="TH SarabunPSK" w:cs="TH SarabunPSK"/>
-          <w:b/>
-          <w:bCs/>
-          <w:sz w:val="32"/>
-          <w:szCs w:val="32"/>
-          <w:cs/>
-        </w:rPr>
-        <w:tab/>
-      </w:r>
-      <w:r>
-        <w:rPr>
-          <w:rFonts w:ascii="TH SarabunPSK" w:hAnsi="TH SarabunPSK" w:cs="TH SarabunPSK"/>
-          <w:b/>
-          <w:bCs/>
-          <w:sz w:val="32"/>
-          <w:szCs w:val="32"/>
-          <w:cs/>
-        </w:rPr>
-        <w:tab/>
-      </w:r>
-      <w:r>
-        <w:rPr>
-          <w:rFonts w:ascii="TH SarabunPSK" w:hAnsi="TH SarabunPSK" w:cs="TH SarabunPSK" w:hint="cs"/>
-          <w:b/>
-          <w:bCs/>
-          <w:sz w:val="32"/>
-          <w:szCs w:val="32"/>
-          <w:cs/>
-        </w:rPr>
-        <w:t xml:space="preserve">6.1 ระบบสแกนบาร์โค้ด </w:t>
-      </w:r>
-      <w:r>
-        <w:rPr>
-          <w:rFonts w:ascii="TH SarabunPSK" w:hAnsi="TH SarabunPSK" w:cs="TH SarabunPSK"/>
-          <w:b/>
-          <w:bCs/>
-          <w:sz w:val="32"/>
-          <w:szCs w:val="32"/>
-        </w:rPr>
-        <w:t>(</w:t>
-      </w:r>
-      <w:r>
-        <w:rPr>
-          <w:rFonts w:ascii="TH SarabunPSK" w:hAnsi="TH SarabunPSK" w:cs="TH SarabunPSK"/>
-          <w:b/>
-          <w:bCs/>
-          <w:sz w:val="32"/>
-          <w:szCs w:val="40"/>
-        </w:rPr>
-        <w:t>Camera Barcode Scanner</w:t>
-      </w:r>
-      <w:r>
-        <w:rPr>
-          <w:rFonts w:ascii="TH SarabunPSK" w:hAnsi="TH SarabunPSK" w:cs="TH SarabunPSK"/>
-          <w:b/>
-          <w:bCs/>
-          <w:sz w:val="32"/>
-          <w:szCs w:val="40"/>
-        </w:rPr>
-        <w:t>)</w:t>
-      </w:r>
-    </w:p>
-    <w:p>
-      <w:pPr>
-        <w:pStyle w:val="NoSpacing"/>
         <w:ind w:left="1440" w:firstLine="720"/>
         <w:jc w:val="thaiDistribute"/>
         <w:rPr>
@@ -5663,110 +6221,91 @@
           <w:szCs w:val="32"/>
         </w:rPr>
       </w:pPr>
-      <w:r>
-        <w:rPr>
-          <w:rFonts w:ascii="TH SarabunPSK" w:hAnsi="TH SarabunPSK" w:cs="TH SarabunPSK"/>
-          <w:sz w:val="32"/>
-          <w:szCs w:val="32"/>
-          <w:cs/>
-        </w:rPr>
-        <w:t xml:space="preserve">มุ่งเน้นการเพิ่มประสิทธิภาพในการจัดการข้อมูลสินค้า โดยสามารถพัฒนาระบบให้รองรับการสแกนบาร์โค้ดและ </w:t>
-      </w:r>
-      <w:r>
-        <w:rPr>
-          <w:rFonts w:ascii="TH SarabunPSK" w:hAnsi="TH SarabunPSK" w:cs="TH SarabunPSK"/>
-          <w:sz w:val="32"/>
-          <w:szCs w:val="32"/>
-        </w:rPr>
-        <w:t xml:space="preserve">QR Code </w:t>
-      </w:r>
-      <w:r>
-        <w:rPr>
-          <w:rFonts w:ascii="TH SarabunPSK" w:hAnsi="TH SarabunPSK" w:cs="TH SarabunPSK"/>
-          <w:sz w:val="32"/>
-          <w:szCs w:val="32"/>
-          <w:cs/>
-        </w:rPr>
-        <w:t>ผ่านกล้องของอุปกรณ์ เช่น โทรศัพท์มือถือหรือแท็บ</w:t>
-      </w:r>
-      <w:proofErr w:type="spellStart"/>
-      <w:r>
-        <w:rPr>
-          <w:rFonts w:ascii="TH SarabunPSK" w:hAnsi="TH SarabunPSK" w:cs="TH SarabunPSK"/>
-          <w:sz w:val="32"/>
-          <w:szCs w:val="32"/>
-          <w:cs/>
-        </w:rPr>
-        <w:t>เล็ต</w:t>
-      </w:r>
-      <w:proofErr w:type="spellEnd"/>
-      <w:r>
-        <w:rPr>
-          <w:rFonts w:ascii="TH SarabunPSK" w:hAnsi="TH SarabunPSK" w:cs="TH SarabunPSK"/>
-          <w:sz w:val="32"/>
-          <w:szCs w:val="32"/>
-          <w:cs/>
-        </w:rPr>
-        <w:t xml:space="preserve"> ซึ่งจะช่วยลดต้นทุนและเพิ่มความสะดวกในการใช้งาน ทั้งนี้ระบบสามารถเชื่อมต่อกับฐานข้อมูลสินค้า</w:t>
-      </w:r>
-      <w:r>
-        <w:rPr>
-          <w:rFonts w:ascii="TH SarabunPSK" w:hAnsi="TH SarabunPSK" w:cs="TH SarabunPSK"/>
-          <w:sz w:val="32"/>
-          <w:szCs w:val="32"/>
-          <w:cs/>
-        </w:rPr>
-        <w:lastRenderedPageBreak/>
-        <w:t>แบบเรียลไทม์ ทำให้การบันทึกข้อมูลมีความรวดเร็วและถูกต้องมากยิ่งขึ้น อีกทั้งยังช่วยให้ผู้เรียนได้ฝึกใช้เทคโนโลยีในสถานการณ์จริง ส่งเสริมทักษะการทำงานและการเรียนรู้เชิงปฏิบัติได้อย่างมีประสิทธิภาพ</w:t>
-      </w:r>
-    </w:p>
-    <w:p>
-      <w:pPr>
-        <w:pStyle w:val="NoSpacing"/>
-        <w:jc w:val="thaiDistribute"/>
-        <w:rPr>
-          <w:rFonts w:ascii="TH SarabunPSK" w:hAnsi="TH SarabunPSK" w:cs="TH SarabunPSK"/>
-          <w:b/>
-          <w:bCs/>
-          <w:szCs w:val="32"/>
-        </w:rPr>
-      </w:pPr>
-      <w:r>
-        <w:rPr>
-          <w:rFonts w:ascii="TH SarabunPSK" w:hAnsi="TH SarabunPSK" w:cs="TH SarabunPSK"/>
-          <w:sz w:val="32"/>
-          <w:szCs w:val="32"/>
-        </w:rPr>
-        <w:tab/>
-      </w:r>
-      <w:r>
-        <w:rPr>
-          <w:rFonts w:ascii="TH SarabunPSK" w:hAnsi="TH SarabunPSK" w:cs="TH SarabunPSK"/>
-          <w:sz w:val="32"/>
-          <w:szCs w:val="32"/>
-        </w:rPr>
-        <w:tab/>
-      </w:r>
-      <w:r>
-        <w:rPr>
-          <w:rFonts w:ascii="TH SarabunPSK" w:hAnsi="TH SarabunPSK" w:cs="TH SarabunPSK"/>
-          <w:b/>
-          <w:bCs/>
-          <w:sz w:val="32"/>
-          <w:szCs w:val="32"/>
-        </w:rPr>
-        <w:t xml:space="preserve">6.2 </w:t>
-      </w:r>
-      <w:r>
-        <w:rPr>
-          <w:rFonts w:ascii="TH SarabunPSK" w:hAnsi="TH SarabunPSK" w:cs="TH SarabunPSK" w:hint="cs"/>
-          <w:b/>
-          <w:bCs/>
-          <w:sz w:val="32"/>
-          <w:szCs w:val="32"/>
-          <w:cs/>
-        </w:rPr>
-        <w:t xml:space="preserve">ระบบสั่งการด้วยเสียง </w:t>
+    </w:p>
+    <w:p>
+      <w:pPr>
+        <w:pStyle w:val="NoSpacing"/>
+        <w:rPr>
+          <w:rFonts w:ascii="TH SarabunPSK" w:hAnsi="TH SarabunPSK" w:cs="TH SarabunPSK"/>
+          <w:b/>
+          <w:bCs/>
+          <w:sz w:val="32"/>
+          <w:szCs w:val="32"/>
+        </w:rPr>
+      </w:pPr>
+      <w:r>
+        <w:rPr>
+          <w:rFonts w:ascii="TH SarabunPSK" w:hAnsi="TH SarabunPSK" w:cs="TH SarabunPSK"/>
+          <w:sz w:val="32"/>
+          <w:szCs w:val="32"/>
+          <w:cs/>
+        </w:rPr>
+        <w:tab/>
+      </w:r>
+      <w:r>
+        <w:rPr>
+          <w:rFonts w:ascii="TH SarabunPSK" w:hAnsi="TH SarabunPSK" w:cs="TH SarabunPSK"/>
+          <w:b/>
+          <w:bCs/>
+          <w:sz w:val="32"/>
+          <w:szCs w:val="32"/>
+        </w:rPr>
+        <w:t xml:space="preserve">6. </w:t>
+      </w:r>
+      <w:r>
+        <w:rPr>
+          <w:rFonts w:ascii="TH SarabunPSK" w:hAnsi="TH SarabunPSK" w:cs="TH SarabunPSK" w:hint="cs"/>
+          <w:b/>
+          <w:bCs/>
+          <w:sz w:val="32"/>
+          <w:szCs w:val="32"/>
+          <w:cs/>
+        </w:rPr>
+        <w:t>แนวทางการพัฒนาต่อยอด</w:t>
+      </w:r>
+    </w:p>
+    <w:p>
+      <w:pPr>
+        <w:pStyle w:val="NoSpacing"/>
+        <w:rPr>
+          <w:rFonts w:ascii="TH SarabunPSK" w:hAnsi="TH SarabunPSK" w:cs="TH SarabunPSK"/>
+          <w:b/>
+          <w:bCs/>
+          <w:szCs w:val="32"/>
+        </w:rPr>
+      </w:pPr>
+      <w:r>
+        <w:rPr>
+          <w:rFonts w:ascii="TH SarabunPSK" w:hAnsi="TH SarabunPSK" w:cs="TH SarabunPSK"/>
+          <w:b/>
+          <w:bCs/>
+          <w:sz w:val="32"/>
+          <w:szCs w:val="32"/>
+          <w:cs/>
+        </w:rPr>
+        <w:tab/>
+      </w:r>
+      <w:r>
+        <w:rPr>
+          <w:rFonts w:ascii="TH SarabunPSK" w:hAnsi="TH SarabunPSK" w:cs="TH SarabunPSK"/>
+          <w:b/>
+          <w:bCs/>
+          <w:sz w:val="32"/>
+          <w:szCs w:val="32"/>
+          <w:cs/>
+        </w:rPr>
+        <w:tab/>
+      </w:r>
+      <w:r>
+        <w:rPr>
+          <w:rFonts w:ascii="TH SarabunPSK" w:hAnsi="TH SarabunPSK" w:cs="TH SarabunPSK" w:hint="cs"/>
+          <w:b/>
+          <w:bCs/>
+          <w:sz w:val="32"/>
+          <w:szCs w:val="32"/>
+          <w:cs/>
+        </w:rPr>
+        <w:t xml:space="preserve">6.1 ระบบสแกนบาร์โค้ด </w:t>
       </w:r>
       <w:r>
         <w:rPr>
@@ -5786,7 +6325,7 @@
           <w:sz w:val="32"/>
           <w:szCs w:val="40"/>
         </w:rPr>
-        <w:t>Voice Command POS</w:t>
+        <w:t>Camera Barcode Scanner</w:t>
       </w:r>
       <w:r>
         <w:rPr>
@@ -5817,6 +6356,159 @@
           <w:szCs w:val="32"/>
           <w:cs/>
         </w:rPr>
+        <w:t xml:space="preserve">มุ่งเน้นการเพิ่มประสิทธิภาพในการจัดการข้อมูลสินค้า โดยสามารถพัฒนาระบบให้รองรับการสแกนบาร์โค้ดและ </w:t>
+      </w:r>
+      <w:r>
+        <w:rPr>
+          <w:rFonts w:ascii="TH SarabunPSK" w:hAnsi="TH SarabunPSK" w:cs="TH SarabunPSK"/>
+          <w:sz w:val="32"/>
+          <w:szCs w:val="32"/>
+        </w:rPr>
+        <w:t xml:space="preserve">QR Code </w:t>
+      </w:r>
+      <w:r>
+        <w:rPr>
+          <w:rFonts w:ascii="TH SarabunPSK" w:hAnsi="TH SarabunPSK" w:cs="TH SarabunPSK"/>
+          <w:sz w:val="32"/>
+          <w:szCs w:val="32"/>
+          <w:cs/>
+        </w:rPr>
+        <w:t xml:space="preserve">ผ่านกล้องของอุปกรณ์ ซึ่งจะช่วยลดต้นทุนและเพิ่มความสะดวกในการใช้งาน </w:t>
+      </w:r>
+    </w:p>
+    <w:p>
+      <w:pPr>
+        <w:pStyle w:val="NoSpacing"/>
+        <w:ind w:left="1440" w:firstLine="720"/>
+        <w:jc w:val="thaiDistribute"/>
+        <w:rPr>
+          <w:rFonts w:ascii="TH SarabunPSK" w:hAnsi="TH SarabunPSK" w:cs="TH SarabunPSK"/>
+          <w:sz w:val="32"/>
+          <w:szCs w:val="32"/>
+        </w:rPr>
+      </w:pPr>
+    </w:p>
+    <w:p>
+      <w:pPr>
+        <w:pStyle w:val="NoSpacing"/>
+        <w:ind w:left="1440" w:firstLine="720"/>
+        <w:jc w:val="thaiDistribute"/>
+        <w:rPr>
+          <w:rFonts w:ascii="TH SarabunPSK" w:hAnsi="TH SarabunPSK" w:cs="TH SarabunPSK"/>
+          <w:sz w:val="32"/>
+          <w:szCs w:val="32"/>
+        </w:rPr>
+      </w:pPr>
+    </w:p>
+    <w:p>
+      <w:pPr>
+        <w:pStyle w:val="NoSpacing"/>
+        <w:ind w:left="1440" w:firstLine="720"/>
+        <w:jc w:val="thaiDistribute"/>
+        <w:rPr>
+          <w:rFonts w:ascii="TH SarabunPSK" w:hAnsi="TH SarabunPSK" w:cs="TH SarabunPSK" w:hint="cs"/>
+          <w:sz w:val="32"/>
+          <w:szCs w:val="32"/>
+        </w:rPr>
+      </w:pPr>
+    </w:p>
+    <w:p>
+      <w:pPr>
+        <w:pStyle w:val="NoSpacing"/>
+        <w:jc w:val="thaiDistribute"/>
+        <w:rPr>
+          <w:rFonts w:ascii="TH SarabunPSK" w:hAnsi="TH SarabunPSK" w:cs="TH SarabunPSK"/>
+          <w:b/>
+          <w:bCs/>
+          <w:szCs w:val="32"/>
+        </w:rPr>
+      </w:pPr>
+      <w:r>
+        <w:rPr>
+          <w:rFonts w:ascii="TH SarabunPSK" w:hAnsi="TH SarabunPSK" w:cs="TH SarabunPSK"/>
+          <w:sz w:val="32"/>
+          <w:szCs w:val="32"/>
+        </w:rPr>
+        <w:tab/>
+      </w:r>
+      <w:r>
+        <w:rPr>
+          <w:rFonts w:ascii="TH SarabunPSK" w:hAnsi="TH SarabunPSK" w:cs="TH SarabunPSK"/>
+          <w:sz w:val="32"/>
+          <w:szCs w:val="32"/>
+        </w:rPr>
+        <w:tab/>
+      </w:r>
+      <w:r>
+        <w:rPr>
+          <w:rFonts w:ascii="TH SarabunPSK" w:hAnsi="TH SarabunPSK" w:cs="TH SarabunPSK"/>
+          <w:b/>
+          <w:bCs/>
+          <w:sz w:val="32"/>
+          <w:szCs w:val="32"/>
+        </w:rPr>
+        <w:t xml:space="preserve">6.2 </w:t>
+      </w:r>
+      <w:r>
+        <w:rPr>
+          <w:rFonts w:ascii="TH SarabunPSK" w:hAnsi="TH SarabunPSK" w:cs="TH SarabunPSK" w:hint="cs"/>
+          <w:b/>
+          <w:bCs/>
+          <w:sz w:val="32"/>
+          <w:szCs w:val="32"/>
+          <w:cs/>
+        </w:rPr>
+        <w:t xml:space="preserve">ระบบสั่งการด้วยเสียง </w:t>
+      </w:r>
+      <w:r>
+        <w:rPr>
+          <w:rFonts w:ascii="TH SarabunPSK" w:hAnsi="TH SarabunPSK" w:cs="TH SarabunPSK"/>
+          <w:b/>
+          <w:bCs/>
+          <w:sz w:val="32"/>
+          <w:szCs w:val="32"/>
+        </w:rPr>
+        <w:t>(</w:t>
+      </w:r>
+      <w:r>
+        <w:rPr>
+          <w:rFonts w:ascii="TH SarabunPSK" w:hAnsi="TH SarabunPSK" w:cs="TH SarabunPSK"/>
+          <w:b/>
+          <w:bCs/>
+          <w:sz w:val="32"/>
+          <w:szCs w:val="40"/>
+        </w:rPr>
+        <w:t>Voice Command POS</w:t>
+      </w:r>
+      <w:r>
+        <w:rPr>
+          <w:rFonts w:ascii="TH SarabunPSK" w:hAnsi="TH SarabunPSK" w:cs="TH SarabunPSK"/>
+          <w:b/>
+          <w:bCs/>
+          <w:sz w:val="32"/>
+          <w:szCs w:val="40"/>
+        </w:rPr>
+        <w:t>)</w:t>
+      </w:r>
+    </w:p>
+    <w:p>
+      <w:pPr>
+        <w:pStyle w:val="NoSpacing"/>
+        <w:ind w:left="1440" w:firstLine="720"/>
+        <w:jc w:val="thaiDistribute"/>
+        <w:rPr>
+          <w:rFonts w:ascii="TH SarabunPSK" w:hAnsi="TH SarabunPSK" w:cs="TH SarabunPSK"/>
+          <w:sz w:val="32"/>
+          <w:szCs w:val="32"/>
+        </w:rPr>
+      </w:pPr>
+      <w:r>
+        <w:rPr>
+          <w:rFonts w:ascii="TH SarabunPSK" w:hAnsi="TH SarabunPSK" w:cs="TH SarabunPSK"/>
+          <w:sz w:val="32"/>
+          <w:szCs w:val="32"/>
+          <w:cs/>
+        </w:rPr>
         <w:t xml:space="preserve">เพิ่มฟังก์ชันการสั่งงานด้วยเสียงในระบบ </w:t>
       </w:r>
       <w:r>
@@ -5834,24 +6526,25 @@
           <w:szCs w:val="32"/>
           <w:cs/>
         </w:rPr>
-        <w:t>เพื่ออำนวยความสะดวกในการใช้งาน โดยใช้เทคโนโลยีแปลงเสียงเป็นข้อความ (</w:t>
-      </w:r>
-      <w:r>
-        <w:rPr>
-          <w:rFonts w:ascii="TH SarabunPSK" w:hAnsi="TH SarabunPSK" w:cs="TH SarabunPSK"/>
-          <w:sz w:val="32"/>
-          <w:szCs w:val="32"/>
-        </w:rPr>
-        <w:t xml:space="preserve">Speech-to-Text) </w:t>
-      </w:r>
-      <w:r>
-        <w:rPr>
-          <w:rFonts w:ascii="TH SarabunPSK" w:hAnsi="TH SarabunPSK" w:cs="TH SarabunPSK"/>
-          <w:sz w:val="32"/>
-          <w:szCs w:val="32"/>
-          <w:cs/>
-        </w:rPr>
-        <w:t xml:space="preserve">ซึ่งสามารถพัฒนาให้รองรับภาษาไทยได้ แนวทางนี้ไม่เพียงช่วยลดขั้นตอนการทำงานและเพิ่มความรวดเร็ว </w:t>
+        <w:t>เพื่ออำนวยความสะดวกในการใช้งาน โดยใช้เทคโนโลยีแปลงเสียงเป็นข้อความ ซึ่งสามารถพัฒนาให้รองรับภาษาไทยได้</w:t>
+      </w:r>
+      <w:r>
+        <w:rPr>
+          <w:rFonts w:ascii="TH SarabunPSK" w:hAnsi="TH SarabunPSK" w:cs="TH SarabunPSK" w:hint="cs"/>
+          <w:sz w:val="32"/>
+          <w:szCs w:val="32"/>
+          <w:cs/>
+        </w:rPr>
+        <w:t xml:space="preserve"> ซึ่งจะ</w:t>
+      </w:r>
+      <w:r>
+        <w:rPr>
+          <w:rFonts w:ascii="TH SarabunPSK" w:hAnsi="TH SarabunPSK" w:cs="TH SarabunPSK"/>
+          <w:sz w:val="32"/>
+          <w:szCs w:val="32"/>
+          <w:cs/>
+        </w:rPr>
+        <w:t xml:space="preserve">ช่วยลดขั้นตอนการทำงานและเพิ่มความรวดเร็ว </w:t>
       </w:r>
     </w:p>
     <w:p>
@@ -6169,36 +6862,6 @@
         <w:pStyle w:val="NoSpacing"/>
         <w:rPr>
           <w:rFonts w:ascii="TH SarabunPSK" w:hAnsi="TH SarabunPSK" w:cs="TH SarabunPSK"/>
-          <w:sz w:val="32"/>
-          <w:szCs w:val="32"/>
-        </w:rPr>
-      </w:pPr>
-    </w:p>
-    <w:p>
-      <w:pPr>
-        <w:pStyle w:val="NoSpacing"/>
-        <w:rPr>
-          <w:rFonts w:ascii="TH SarabunPSK" w:hAnsi="TH SarabunPSK" w:cs="TH SarabunPSK"/>
-          <w:sz w:val="32"/>
-          <w:szCs w:val="32"/>
-        </w:rPr>
-      </w:pPr>
-    </w:p>
-    <w:p>
-      <w:pPr>
-        <w:pStyle w:val="NoSpacing"/>
-        <w:rPr>
-          <w:rFonts w:ascii="TH SarabunPSK" w:hAnsi="TH SarabunPSK" w:cs="TH SarabunPSK"/>
-          <w:sz w:val="32"/>
-          <w:szCs w:val="32"/>
-        </w:rPr>
-      </w:pPr>
-    </w:p>
-    <w:p>
-      <w:pPr>
-        <w:pStyle w:val="NoSpacing"/>
-        <w:rPr>
-          <w:rFonts w:ascii="TH SarabunPSK" w:hAnsi="TH SarabunPSK" w:cs="TH SarabunPSK"/>
           <w:b/>
           <w:bCs/>
           <w:sz w:val="32"/>
@@ -6358,19 +7021,278 @@
           <w:sz w:val="32"/>
           <w:szCs w:val="32"/>
         </w:rPr>
+        <w:t xml:space="preserve">1) </w:t>
+      </w:r>
+      <w:r>
+        <w:rPr>
+          <w:rFonts w:ascii="TH SarabunPSK" w:hAnsi="TH SarabunPSK" w:cs="TH SarabunPSK"/>
+          <w:b/>
+          <w:bCs/>
+          <w:sz w:val="32"/>
+          <w:szCs w:val="32"/>
+          <w:cs/>
+        </w:rPr>
+        <w:t>สำหรับนักเรียนผู้ขาย</w:t>
+      </w:r>
+      <w:r>
+        <w:rPr>
+          <w:rFonts w:ascii="TH SarabunPSK" w:hAnsi="TH SarabunPSK" w:cs="TH SarabunPSK"/>
+          <w:b/>
+          <w:bCs/>
+          <w:sz w:val="32"/>
+          <w:szCs w:val="32"/>
+        </w:rPr>
+        <w:t>:</w:t>
+      </w:r>
+      <w:r>
+        <w:rPr>
+          <w:rFonts w:ascii="TH SarabunPSK" w:hAnsi="TH SarabunPSK" w:cs="TH SarabunPSK"/>
+          <w:sz w:val="32"/>
+          <w:szCs w:val="32"/>
+        </w:rPr>
+        <w:t> </w:t>
+      </w:r>
+      <w:r>
+        <w:rPr>
+          <w:rFonts w:ascii="TH SarabunPSK" w:hAnsi="TH SarabunPSK" w:cs="TH SarabunPSK"/>
+          <w:sz w:val="32"/>
+          <w:szCs w:val="32"/>
+          <w:cs/>
+        </w:rPr>
+        <w:t xml:space="preserve">นักเรียนเข้าสู่ระบบด้วยรหัสนักเรียนและรหัส </w:t>
+      </w:r>
+      <w:r>
+        <w:rPr>
+          <w:rFonts w:ascii="TH SarabunPSK" w:hAnsi="TH SarabunPSK" w:cs="TH SarabunPSK"/>
+          <w:sz w:val="32"/>
+          <w:szCs w:val="32"/>
+        </w:rPr>
+        <w:t xml:space="preserve">PIN </w:t>
+      </w:r>
+      <w:r>
+        <w:rPr>
+          <w:rFonts w:ascii="TH SarabunPSK" w:hAnsi="TH SarabunPSK" w:cs="TH SarabunPSK"/>
+          <w:sz w:val="32"/>
+          <w:szCs w:val="32"/>
+          <w:cs/>
+        </w:rPr>
+        <w:t xml:space="preserve">ส่วนตัว เลือกสินค้าด้วยการแตะที่หน้า </w:t>
+      </w:r>
+      <w:r>
+        <w:rPr>
+          <w:rFonts w:ascii="TH SarabunPSK" w:hAnsi="TH SarabunPSK" w:cs="TH SarabunPSK"/>
+          <w:sz w:val="32"/>
+          <w:szCs w:val="32"/>
+        </w:rPr>
+        <w:t xml:space="preserve">POS </w:t>
+      </w:r>
+      <w:r>
+        <w:rPr>
+          <w:rFonts w:ascii="TH SarabunPSK" w:hAnsi="TH SarabunPSK" w:cs="TH SarabunPSK"/>
+          <w:sz w:val="32"/>
+          <w:szCs w:val="32"/>
+          <w:cs/>
+        </w:rPr>
+        <w:t>ระบุ</w:t>
+      </w:r>
+      <w:r>
+        <w:rPr>
+          <w:rFonts w:ascii="TH SarabunPSK" w:hAnsi="TH SarabunPSK" w:cs="TH SarabunPSK" w:hint="cs"/>
+          <w:sz w:val="32"/>
+          <w:szCs w:val="32"/>
+          <w:cs/>
+        </w:rPr>
+        <w:t>ชื่อ</w:t>
+      </w:r>
+      <w:r>
+        <w:rPr>
+          <w:rFonts w:ascii="TH SarabunPSK" w:hAnsi="TH SarabunPSK" w:cs="TH SarabunPSK"/>
+          <w:sz w:val="32"/>
+          <w:szCs w:val="32"/>
+          <w:cs/>
+        </w:rPr>
+        <w:t>ผู้ซื้อ และกดปุ่ม "ชำระเงิน" ระบบจะคำนวณยอดขายและบันทึกอัตโนมัติ</w:t>
+      </w:r>
+      <w:r>
+        <w:rPr>
+          <w:rFonts w:ascii="TH SarabunPSK" w:hAnsi="TH SarabunPSK" w:cs="TH SarabunPSK" w:hint="cs"/>
+          <w:sz w:val="32"/>
+          <w:szCs w:val="32"/>
+          <w:cs/>
+        </w:rPr>
+        <w:t xml:space="preserve"> </w:t>
+      </w:r>
+      <w:r>
+        <w:rPr>
+          <w:rFonts w:ascii="TH SarabunPSK" w:hAnsi="TH SarabunPSK" w:cs="TH SarabunPSK"/>
+          <w:sz w:val="32"/>
+          <w:szCs w:val="32"/>
+          <w:cs/>
+        </w:rPr>
+        <w:t>พร้อมหักสต็อกและ</w:t>
+      </w:r>
+      <w:r>
+        <w:rPr>
+          <w:rFonts w:ascii="TH SarabunPSK" w:hAnsi="TH SarabunPSK" w:cs="TH SarabunPSK" w:hint="cs"/>
+          <w:sz w:val="32"/>
+          <w:szCs w:val="32"/>
+          <w:cs/>
+        </w:rPr>
+        <w:t>คำนวณเงินเฉลี่ยคืน</w:t>
+      </w:r>
+    </w:p>
+    <w:p>
+      <w:pPr>
+        <w:pStyle w:val="NoSpacing"/>
+        <w:ind w:left="1440" w:firstLine="720"/>
+        <w:rPr>
+          <w:rFonts w:ascii="TH SarabunPSK" w:hAnsi="TH SarabunPSK" w:cs="TH SarabunPSK"/>
+          <w:sz w:val="32"/>
+          <w:szCs w:val="32"/>
+        </w:rPr>
+      </w:pPr>
+      <w:r>
+        <w:rPr>
+          <w:rFonts w:ascii="TH SarabunPSK" w:hAnsi="TH SarabunPSK" w:cs="TH SarabunPSK"/>
+          <w:b/>
+          <w:bCs/>
+          <w:sz w:val="32"/>
+          <w:szCs w:val="32"/>
+        </w:rPr>
+        <w:t xml:space="preserve">2) </w:t>
+      </w:r>
+      <w:r>
+        <w:rPr>
+          <w:rFonts w:ascii="TH SarabunPSK" w:hAnsi="TH SarabunPSK" w:cs="TH SarabunPSK"/>
+          <w:b/>
+          <w:bCs/>
+          <w:sz w:val="32"/>
+          <w:szCs w:val="32"/>
+          <w:cs/>
+        </w:rPr>
+        <w:t>สำหรับนักเรียนสมาชิก</w:t>
+      </w:r>
+      <w:r>
+        <w:rPr>
+          <w:rFonts w:ascii="TH SarabunPSK" w:hAnsi="TH SarabunPSK" w:cs="TH SarabunPSK"/>
+          <w:b/>
+          <w:bCs/>
+          <w:sz w:val="32"/>
+          <w:szCs w:val="32"/>
+        </w:rPr>
+        <w:t>:</w:t>
+      </w:r>
+      <w:r>
+        <w:rPr>
+          <w:rFonts w:ascii="TH SarabunPSK" w:hAnsi="TH SarabunPSK" w:cs="TH SarabunPSK"/>
+          <w:sz w:val="32"/>
+          <w:szCs w:val="32"/>
+        </w:rPr>
+        <w:t> </w:t>
+      </w:r>
+      <w:r>
+        <w:rPr>
+          <w:rFonts w:ascii="TH SarabunPSK" w:hAnsi="TH SarabunPSK" w:cs="TH SarabunPSK"/>
+          <w:sz w:val="32"/>
+          <w:szCs w:val="32"/>
+          <w:cs/>
+        </w:rPr>
+        <w:t>สามารถเสนอเพิ่มสินค้าใหม่ แก้ไขราคา หรือเติมสต็อก ผ่านระบบคำขออนุมัติ</w:t>
+      </w:r>
+      <w:r>
+        <w:rPr>
+          <w:rFonts w:ascii="TH SarabunPSK" w:hAnsi="TH SarabunPSK" w:cs="TH SarabunPSK" w:hint="cs"/>
+          <w:sz w:val="32"/>
+          <w:szCs w:val="32"/>
+          <w:cs/>
+        </w:rPr>
+        <w:t xml:space="preserve"> </w:t>
+      </w:r>
+      <w:r>
+        <w:rPr>
+          <w:rFonts w:ascii="TH SarabunPSK" w:hAnsi="TH SarabunPSK" w:cs="TH SarabunPSK"/>
+          <w:sz w:val="32"/>
+          <w:szCs w:val="32"/>
+          <w:cs/>
+        </w:rPr>
+        <w:t>ซึ่งครูที่ปรึกษาจะเป็นผู้พิจารณา</w:t>
+      </w:r>
+      <w:r>
+        <w:rPr>
+          <w:rFonts w:ascii="TH SarabunPSK" w:hAnsi="TH SarabunPSK" w:cs="TH SarabunPSK" w:hint="cs"/>
+          <w:sz w:val="32"/>
+          <w:szCs w:val="32"/>
+          <w:cs/>
+        </w:rPr>
+        <w:t>และให้คำอนุมัติก่อน</w:t>
+      </w:r>
+      <w:r>
+        <w:rPr>
+          <w:rFonts w:ascii="TH SarabunPSK" w:hAnsi="TH SarabunPSK" w:cs="TH SarabunPSK"/>
+          <w:sz w:val="32"/>
+          <w:szCs w:val="32"/>
+          <w:cs/>
+        </w:rPr>
+        <w:t xml:space="preserve"> นอกจากนี้ยังสามารถทำ</w:t>
+      </w:r>
+      <w:r>
+        <w:rPr>
+          <w:rFonts w:ascii="TH SarabunPSK" w:hAnsi="TH SarabunPSK" w:cs="TH SarabunPSK"/>
+          <w:sz w:val="32"/>
+          <w:szCs w:val="32"/>
+          <w:cs/>
+        </w:rPr>
         <w:lastRenderedPageBreak/>
-        <w:t xml:space="preserve">1) </w:t>
-      </w:r>
-      <w:r>
-        <w:rPr>
-          <w:rFonts w:ascii="TH SarabunPSK" w:hAnsi="TH SarabunPSK" w:cs="TH SarabunPSK"/>
-          <w:b/>
-          <w:bCs/>
-          <w:sz w:val="32"/>
-          <w:szCs w:val="32"/>
-          <w:cs/>
-        </w:rPr>
-        <w:t>สำหรับนักเรียนผู้ขาย</w:t>
+        <w:t xml:space="preserve">แบบฝึกหัด สหกรณ์ </w:t>
+      </w:r>
+      <w:r>
+        <w:rPr>
+          <w:rFonts w:ascii="TH SarabunPSK" w:hAnsi="TH SarabunPSK" w:cs="TH SarabunPSK"/>
+          <w:sz w:val="32"/>
+          <w:szCs w:val="32"/>
+        </w:rPr>
+        <w:t xml:space="preserve">Quiz </w:t>
+      </w:r>
+      <w:r>
+        <w:rPr>
+          <w:rFonts w:ascii="TH SarabunPSK" w:hAnsi="TH SarabunPSK" w:cs="TH SarabunPSK"/>
+          <w:sz w:val="32"/>
+          <w:szCs w:val="32"/>
+          <w:cs/>
+        </w:rPr>
+        <w:t>บูรณาการกับการเรียนการสอนได้ และดูยอดถือหุ้น เงินปันผล และเงินเฉลี่ยคืนของตนเองได้ตลอดเวลา</w:t>
+      </w:r>
+    </w:p>
+    <w:p>
+      <w:pPr>
+        <w:pStyle w:val="NoSpacing"/>
+        <w:ind w:left="1440" w:firstLine="720"/>
+        <w:rPr>
+          <w:rFonts w:ascii="TH SarabunPSK" w:hAnsi="TH SarabunPSK" w:cs="TH SarabunPSK"/>
+          <w:sz w:val="32"/>
+          <w:szCs w:val="32"/>
+        </w:rPr>
+      </w:pPr>
+      <w:r>
+        <w:rPr>
+          <w:rFonts w:ascii="TH SarabunPSK" w:hAnsi="TH SarabunPSK" w:cs="TH SarabunPSK"/>
+          <w:b/>
+          <w:bCs/>
+          <w:sz w:val="32"/>
+          <w:szCs w:val="32"/>
+        </w:rPr>
+        <w:t xml:space="preserve">3) </w:t>
+      </w:r>
+      <w:r>
+        <w:rPr>
+          <w:rFonts w:ascii="TH SarabunPSK" w:hAnsi="TH SarabunPSK" w:cs="TH SarabunPSK"/>
+          <w:b/>
+          <w:bCs/>
+          <w:sz w:val="32"/>
+          <w:szCs w:val="32"/>
+          <w:cs/>
+        </w:rPr>
+        <w:t>สำหรับครูที่ปรึกษา</w:t>
       </w:r>
       <w:r>
         <w:rPr>
@@ -6397,7 +7319,7 @@
           <w:szCs w:val="32"/>
           <w:cs/>
         </w:rPr>
-        <w:t xml:space="preserve">นักเรียนเข้าสู่ระบบด้วยรหัสนักเรียนและรหัส </w:t>
+        <w:t xml:space="preserve">เข้าใช้งานด้วยรหัสและ </w:t>
       </w:r>
       <w:r>
         <w:rPr>
@@ -6414,69 +7336,104 @@
           <w:szCs w:val="32"/>
           <w:cs/>
         </w:rPr>
-        <w:t xml:space="preserve">ส่วนตัว เลือกสินค้าด้วยการแตะที่หน้า </w:t>
-      </w:r>
-      <w:r>
-        <w:rPr>
-          <w:rFonts w:ascii="TH SarabunPSK" w:hAnsi="TH SarabunPSK" w:cs="TH SarabunPSK"/>
-          <w:sz w:val="32"/>
-          <w:szCs w:val="32"/>
-        </w:rPr>
-        <w:t xml:space="preserve">POS </w:t>
-      </w:r>
-      <w:r>
-        <w:rPr>
-          <w:rFonts w:ascii="TH SarabunPSK" w:hAnsi="TH SarabunPSK" w:cs="TH SarabunPSK"/>
-          <w:sz w:val="32"/>
-          <w:szCs w:val="32"/>
-          <w:cs/>
-        </w:rPr>
-        <w:t>ระบุ</w:t>
-      </w:r>
-      <w:r>
-        <w:rPr>
-          <w:rFonts w:ascii="TH SarabunPSK" w:hAnsi="TH SarabunPSK" w:cs="TH SarabunPSK" w:hint="cs"/>
-          <w:sz w:val="32"/>
-          <w:szCs w:val="32"/>
-          <w:cs/>
-        </w:rPr>
-        <w:t>ชื่อ</w:t>
-      </w:r>
-      <w:r>
-        <w:rPr>
-          <w:rFonts w:ascii="TH SarabunPSK" w:hAnsi="TH SarabunPSK" w:cs="TH SarabunPSK"/>
-          <w:sz w:val="32"/>
-          <w:szCs w:val="32"/>
-          <w:cs/>
-        </w:rPr>
-        <w:t>ผู้ซื้อ และกดปุ่ม "ชำระเงิน" ระบบจะคำนวณยอดขายและบันทึกอัตโนมัติ</w:t>
-      </w:r>
-      <w:r>
-        <w:rPr>
-          <w:rFonts w:ascii="TH SarabunPSK" w:hAnsi="TH SarabunPSK" w:cs="TH SarabunPSK" w:hint="cs"/>
-          <w:sz w:val="32"/>
-          <w:szCs w:val="32"/>
-          <w:cs/>
-        </w:rPr>
-        <w:t xml:space="preserve"> </w:t>
-      </w:r>
-      <w:r>
-        <w:rPr>
-          <w:rFonts w:ascii="TH SarabunPSK" w:hAnsi="TH SarabunPSK" w:cs="TH SarabunPSK"/>
-          <w:sz w:val="32"/>
-          <w:szCs w:val="32"/>
-          <w:cs/>
-        </w:rPr>
-        <w:t>พร้อมหักสต็อกและ</w:t>
-      </w:r>
-      <w:r>
-        <w:rPr>
-          <w:rFonts w:ascii="TH SarabunPSK" w:hAnsi="TH SarabunPSK" w:cs="TH SarabunPSK" w:hint="cs"/>
-          <w:sz w:val="32"/>
-          <w:szCs w:val="32"/>
-          <w:cs/>
-        </w:rPr>
-        <w:t>คำนวณเงินเฉลี่ยคืน</w:t>
+        <w:t xml:space="preserve">เฉพาะ มีสิทธิ์เข้าหน้า </w:t>
+      </w:r>
+      <w:r>
+        <w:rPr>
+          <w:rFonts w:ascii="TH SarabunPSK" w:hAnsi="TH SarabunPSK" w:cs="TH SarabunPSK"/>
+          <w:sz w:val="32"/>
+          <w:szCs w:val="32"/>
+        </w:rPr>
+        <w:t>Admin</w:t>
+      </w:r>
+      <w:r>
+        <w:rPr>
+          <w:rFonts w:ascii="TH SarabunPSK" w:hAnsi="TH SarabunPSK" w:cs="TH SarabunPSK"/>
+          <w:sz w:val="32"/>
+          <w:szCs w:val="32"/>
+          <w:cs/>
+        </w:rPr>
+        <w:t xml:space="preserve"> สามารถดู</w:t>
+      </w:r>
+      <w:proofErr w:type="spellStart"/>
+      <w:r>
+        <w:rPr>
+          <w:rFonts w:ascii="TH SarabunPSK" w:hAnsi="TH SarabunPSK" w:cs="TH SarabunPSK"/>
+          <w:sz w:val="32"/>
+          <w:szCs w:val="32"/>
+          <w:cs/>
+        </w:rPr>
+        <w:t>แดช</w:t>
+      </w:r>
+      <w:proofErr w:type="spellEnd"/>
+      <w:r>
+        <w:rPr>
+          <w:rFonts w:ascii="TH SarabunPSK" w:hAnsi="TH SarabunPSK" w:cs="TH SarabunPSK"/>
+          <w:sz w:val="32"/>
+          <w:szCs w:val="32"/>
+          <w:cs/>
+        </w:rPr>
+        <w:t xml:space="preserve">บอร์ดวิเคราะห์ยอดขายแบบ </w:t>
+      </w:r>
+      <w:r>
+        <w:rPr>
+          <w:rFonts w:ascii="TH SarabunPSK" w:hAnsi="TH SarabunPSK" w:cs="TH SarabunPSK"/>
+          <w:sz w:val="32"/>
+          <w:szCs w:val="32"/>
+        </w:rPr>
+        <w:t xml:space="preserve">Real-time </w:t>
+      </w:r>
+      <w:r>
+        <w:rPr>
+          <w:rFonts w:ascii="TH SarabunPSK" w:hAnsi="TH SarabunPSK" w:cs="TH SarabunPSK"/>
+          <w:sz w:val="32"/>
+          <w:szCs w:val="32"/>
+          <w:cs/>
+        </w:rPr>
+        <w:t xml:space="preserve">อนุมัติคำขอของนักเรียน จ่ายเงินปันผล/เฉลี่ยคืน ตรวจสอบประวัติการกระทำผ่าน </w:t>
+      </w:r>
+      <w:r>
+        <w:rPr>
+          <w:rFonts w:ascii="TH SarabunPSK" w:hAnsi="TH SarabunPSK" w:cs="TH SarabunPSK"/>
+          <w:sz w:val="32"/>
+          <w:szCs w:val="32"/>
+        </w:rPr>
+        <w:t xml:space="preserve">Audit Log </w:t>
+      </w:r>
+      <w:r>
+        <w:rPr>
+          <w:rFonts w:ascii="TH SarabunPSK" w:hAnsi="TH SarabunPSK" w:cs="TH SarabunPSK"/>
+          <w:sz w:val="32"/>
+          <w:szCs w:val="32"/>
+          <w:cs/>
+        </w:rPr>
+        <w:t>และส่งออกรายงาน</w:t>
+      </w:r>
+      <w:r>
+        <w:rPr>
+          <w:rFonts w:ascii="TH SarabunPSK" w:hAnsi="TH SarabunPSK" w:cs="TH SarabunPSK" w:hint="cs"/>
+          <w:sz w:val="32"/>
+          <w:szCs w:val="32"/>
+          <w:cs/>
+        </w:rPr>
+        <w:t>ยอดขาย</w:t>
+      </w:r>
+      <w:r>
+        <w:rPr>
+          <w:rFonts w:ascii="TH SarabunPSK" w:hAnsi="TH SarabunPSK" w:cs="TH SarabunPSK"/>
+          <w:sz w:val="32"/>
+          <w:szCs w:val="32"/>
+          <w:cs/>
+        </w:rPr>
+        <w:t xml:space="preserve">เป็นเอกสาร </w:t>
+      </w:r>
+      <w:r>
+        <w:rPr>
+          <w:rFonts w:ascii="TH SarabunPSK" w:hAnsi="TH SarabunPSK" w:cs="TH SarabunPSK"/>
+          <w:sz w:val="32"/>
+          <w:szCs w:val="32"/>
+        </w:rPr>
+        <w:t xml:space="preserve">PDF/Excel </w:t>
       </w:r>
     </w:p>
     <w:p>
@@ -6497,28 +7454,18 @@
           <w:sz w:val="32"/>
           <w:szCs w:val="32"/>
         </w:rPr>
-        <w:t xml:space="preserve">2) </w:t>
-      </w:r>
-      <w:r>
-        <w:rPr>
-          <w:rFonts w:ascii="TH SarabunPSK" w:hAnsi="TH SarabunPSK" w:cs="TH SarabunPSK"/>
-          <w:b/>
-          <w:bCs/>
-          <w:sz w:val="32"/>
-          <w:szCs w:val="32"/>
-          <w:cs/>
-        </w:rPr>
-        <w:t>สำหรับนักเรียนสมาชิก</w:t>
-      </w:r>
-      <w:r>
-        <w:rPr>
-          <w:rFonts w:ascii="TH SarabunPSK" w:hAnsi="TH SarabunPSK" w:cs="TH SarabunPSK"/>
-          <w:b/>
-          <w:bCs/>
-          <w:sz w:val="32"/>
-          <w:szCs w:val="32"/>
-        </w:rPr>
-        <w:t>:</w:t>
+        <w:t xml:space="preserve">4) </w:t>
+      </w:r>
+      <w:r>
+        <w:rPr>
+          <w:rFonts w:ascii="TH SarabunPSK" w:hAnsi="TH SarabunPSK" w:cs="TH SarabunPSK"/>
+          <w:b/>
+          <w:bCs/>
+          <w:sz w:val="32"/>
+          <w:szCs w:val="32"/>
+          <w:cs/>
+        </w:rPr>
+        <w:t>การติดตั้งและเข้าถึง:</w:t>
       </w:r>
       <w:r>
         <w:rPr>
@@ -6535,281 +7482,6 @@
           <w:szCs w:val="32"/>
           <w:cs/>
         </w:rPr>
-        <w:t>สามารถเสนอเพิ่มสินค้าใหม่ แก้ไขราคา หรือเติมสต็อก ผ่านระบบคำขออนุมัติ</w:t>
-      </w:r>
-      <w:r>
-        <w:rPr>
-          <w:rFonts w:ascii="TH SarabunPSK" w:hAnsi="TH SarabunPSK" w:cs="TH SarabunPSK" w:hint="cs"/>
-          <w:sz w:val="32"/>
-          <w:szCs w:val="32"/>
-          <w:cs/>
-        </w:rPr>
-        <w:t xml:space="preserve"> </w:t>
-      </w:r>
-      <w:r>
-        <w:rPr>
-          <w:rFonts w:ascii="TH SarabunPSK" w:hAnsi="TH SarabunPSK" w:cs="TH SarabunPSK"/>
-          <w:sz w:val="32"/>
-          <w:szCs w:val="32"/>
-          <w:cs/>
-        </w:rPr>
-        <w:t>ซึ่งครูที่ปรึกษาจะเป็นผู้พิจารณา</w:t>
-      </w:r>
-      <w:r>
-        <w:rPr>
-          <w:rFonts w:ascii="TH SarabunPSK" w:hAnsi="TH SarabunPSK" w:cs="TH SarabunPSK" w:hint="cs"/>
-          <w:sz w:val="32"/>
-          <w:szCs w:val="32"/>
-          <w:cs/>
-        </w:rPr>
-        <w:t>และให้คำอนุมัติก่อน</w:t>
-      </w:r>
-      <w:r>
-        <w:rPr>
-          <w:rFonts w:ascii="TH SarabunPSK" w:hAnsi="TH SarabunPSK" w:cs="TH SarabunPSK"/>
-          <w:sz w:val="32"/>
-          <w:szCs w:val="32"/>
-          <w:cs/>
-        </w:rPr>
-        <w:t xml:space="preserve"> นอกจากนี้ยังสามารถทำแบบฝึกหัด สหกรณ์ </w:t>
-      </w:r>
-      <w:r>
-        <w:rPr>
-          <w:rFonts w:ascii="TH SarabunPSK" w:hAnsi="TH SarabunPSK" w:cs="TH SarabunPSK"/>
-          <w:sz w:val="32"/>
-          <w:szCs w:val="32"/>
-        </w:rPr>
-        <w:t xml:space="preserve">Quiz </w:t>
-      </w:r>
-      <w:r>
-        <w:rPr>
-          <w:rFonts w:ascii="TH SarabunPSK" w:hAnsi="TH SarabunPSK" w:cs="TH SarabunPSK"/>
-          <w:sz w:val="32"/>
-          <w:szCs w:val="32"/>
-          <w:cs/>
-        </w:rPr>
-        <w:t>บูรณาการกับการเรียนการสอนได้ และดูยอดถือหุ้น เงินปันผล และเงินเฉลี่ยคืนของตนเองได้ตลอดเวลา</w:t>
-      </w:r>
-    </w:p>
-    <w:p>
-      <w:pPr>
-        <w:pStyle w:val="NoSpacing"/>
-        <w:ind w:left="1440" w:firstLine="720"/>
-        <w:rPr>
-          <w:rFonts w:ascii="TH SarabunPSK" w:hAnsi="TH SarabunPSK" w:cs="TH SarabunPSK" w:hint="cs"/>
-          <w:sz w:val="32"/>
-          <w:szCs w:val="32"/>
-        </w:rPr>
-      </w:pPr>
-      <w:r>
-        <w:rPr>
-          <w:rFonts w:ascii="TH SarabunPSK" w:hAnsi="TH SarabunPSK" w:cs="TH SarabunPSK"/>
-          <w:b/>
-          <w:bCs/>
-          <w:sz w:val="32"/>
-          <w:szCs w:val="32"/>
-        </w:rPr>
-        <w:t xml:space="preserve">3) </w:t>
-      </w:r>
-      <w:r>
-        <w:rPr>
-          <w:rFonts w:ascii="TH SarabunPSK" w:hAnsi="TH SarabunPSK" w:cs="TH SarabunPSK"/>
-          <w:b/>
-          <w:bCs/>
-          <w:sz w:val="32"/>
-          <w:szCs w:val="32"/>
-          <w:cs/>
-        </w:rPr>
-        <w:t>สำหรับครูที่ปรึกษา</w:t>
-      </w:r>
-      <w:r>
-        <w:rPr>
-          <w:rFonts w:ascii="TH SarabunPSK" w:hAnsi="TH SarabunPSK" w:cs="TH SarabunPSK"/>
-          <w:b/>
-          <w:bCs/>
-          <w:sz w:val="32"/>
-          <w:szCs w:val="32"/>
-        </w:rPr>
-        <w:t>:</w:t>
-      </w:r>
-      <w:r>
-        <w:rPr>
-          <w:rFonts w:ascii="TH SarabunPSK" w:hAnsi="TH SarabunPSK" w:cs="TH SarabunPSK"/>
-          <w:sz w:val="32"/>
-          <w:szCs w:val="32"/>
-        </w:rPr>
-        <w:t> </w:t>
-      </w:r>
-      <w:r>
-        <w:rPr>
-          <w:rFonts w:ascii="TH SarabunPSK" w:hAnsi="TH SarabunPSK" w:cs="TH SarabunPSK"/>
-          <w:sz w:val="32"/>
-          <w:szCs w:val="32"/>
-          <w:cs/>
-        </w:rPr>
-        <w:t xml:space="preserve">เข้าใช้งานด้วยรหัสและ </w:t>
-      </w:r>
-      <w:r>
-        <w:rPr>
-          <w:rFonts w:ascii="TH SarabunPSK" w:hAnsi="TH SarabunPSK" w:cs="TH SarabunPSK"/>
-          <w:sz w:val="32"/>
-          <w:szCs w:val="32"/>
-        </w:rPr>
-        <w:t xml:space="preserve">PIN </w:t>
-      </w:r>
-      <w:r>
-        <w:rPr>
-          <w:rFonts w:ascii="TH SarabunPSK" w:hAnsi="TH SarabunPSK" w:cs="TH SarabunPSK"/>
-          <w:sz w:val="32"/>
-          <w:szCs w:val="32"/>
-          <w:cs/>
-        </w:rPr>
-        <w:t xml:space="preserve">เฉพาะ มีสิทธิ์เข้าหน้า </w:t>
-      </w:r>
-      <w:r>
-        <w:rPr>
-          <w:rFonts w:ascii="TH SarabunPSK" w:hAnsi="TH SarabunPSK" w:cs="TH SarabunPSK"/>
-          <w:sz w:val="32"/>
-          <w:szCs w:val="32"/>
-        </w:rPr>
-        <w:t>Admin</w:t>
-      </w:r>
-      <w:r>
-        <w:rPr>
-          <w:rFonts w:ascii="TH SarabunPSK" w:hAnsi="TH SarabunPSK" w:cs="TH SarabunPSK"/>
-          <w:sz w:val="32"/>
-          <w:szCs w:val="32"/>
-          <w:cs/>
-        </w:rPr>
-        <w:t xml:space="preserve"> สามารถดู</w:t>
-      </w:r>
-      <w:proofErr w:type="spellStart"/>
-      <w:r>
-        <w:rPr>
-          <w:rFonts w:ascii="TH SarabunPSK" w:hAnsi="TH SarabunPSK" w:cs="TH SarabunPSK"/>
-          <w:sz w:val="32"/>
-          <w:szCs w:val="32"/>
-          <w:cs/>
-        </w:rPr>
-        <w:t>แดช</w:t>
-      </w:r>
-      <w:proofErr w:type="spellEnd"/>
-      <w:r>
-        <w:rPr>
-          <w:rFonts w:ascii="TH SarabunPSK" w:hAnsi="TH SarabunPSK" w:cs="TH SarabunPSK"/>
-          <w:sz w:val="32"/>
-          <w:szCs w:val="32"/>
-          <w:cs/>
-        </w:rPr>
-        <w:t xml:space="preserve">บอร์ดวิเคราะห์ยอดขายแบบ </w:t>
-      </w:r>
-      <w:r>
-        <w:rPr>
-          <w:rFonts w:ascii="TH SarabunPSK" w:hAnsi="TH SarabunPSK" w:cs="TH SarabunPSK"/>
-          <w:sz w:val="32"/>
-          <w:szCs w:val="32"/>
-        </w:rPr>
-        <w:t xml:space="preserve">Real-time </w:t>
-      </w:r>
-      <w:r>
-        <w:rPr>
-          <w:rFonts w:ascii="TH SarabunPSK" w:hAnsi="TH SarabunPSK" w:cs="TH SarabunPSK"/>
-          <w:sz w:val="32"/>
-          <w:szCs w:val="32"/>
-          <w:cs/>
-        </w:rPr>
-        <w:t xml:space="preserve">อนุมัติคำขอของนักเรียน จ่ายเงินปันผล/เฉลี่ยคืน ตรวจสอบประวัติการกระทำผ่าน </w:t>
-      </w:r>
-      <w:r>
-        <w:rPr>
-          <w:rFonts w:ascii="TH SarabunPSK" w:hAnsi="TH SarabunPSK" w:cs="TH SarabunPSK"/>
-          <w:sz w:val="32"/>
-          <w:szCs w:val="32"/>
-        </w:rPr>
-        <w:t xml:space="preserve">Audit Log </w:t>
-      </w:r>
-      <w:r>
-        <w:rPr>
-          <w:rFonts w:ascii="TH SarabunPSK" w:hAnsi="TH SarabunPSK" w:cs="TH SarabunPSK"/>
-          <w:sz w:val="32"/>
-          <w:szCs w:val="32"/>
-          <w:cs/>
-        </w:rPr>
-        <w:t>และส่งออกรายงาน</w:t>
-      </w:r>
-      <w:r>
-        <w:rPr>
-          <w:rFonts w:ascii="TH SarabunPSK" w:hAnsi="TH SarabunPSK" w:cs="TH SarabunPSK" w:hint="cs"/>
-          <w:sz w:val="32"/>
-          <w:szCs w:val="32"/>
-          <w:cs/>
-        </w:rPr>
-        <w:t>ยอดขาย</w:t>
-      </w:r>
-      <w:r>
-        <w:rPr>
-          <w:rFonts w:ascii="TH SarabunPSK" w:hAnsi="TH SarabunPSK" w:cs="TH SarabunPSK"/>
-          <w:sz w:val="32"/>
-          <w:szCs w:val="32"/>
-          <w:cs/>
-        </w:rPr>
-        <w:t xml:space="preserve">เป็นเอกสาร </w:t>
-      </w:r>
-      <w:r>
-        <w:rPr>
-          <w:rFonts w:ascii="TH SarabunPSK" w:hAnsi="TH SarabunPSK" w:cs="TH SarabunPSK"/>
-          <w:sz w:val="32"/>
-          <w:szCs w:val="32"/>
-        </w:rPr>
-        <w:t xml:space="preserve">PDF/Excel </w:t>
-      </w:r>
-    </w:p>
-    <w:p>
-      <w:pPr>
-        <w:pStyle w:val="NoSpacing"/>
-        <w:ind w:left="1440" w:firstLine="720"/>
-        <w:rPr>
-          <w:rFonts w:ascii="TH SarabunPSK" w:hAnsi="TH SarabunPSK" w:cs="TH SarabunPSK"/>
-          <w:sz w:val="32"/>
-          <w:szCs w:val="32"/>
-        </w:rPr>
-      </w:pPr>
-      <w:r>
-        <w:rPr>
-          <w:rFonts w:ascii="TH SarabunPSK" w:hAnsi="TH SarabunPSK" w:cs="TH SarabunPSK"/>
-          <w:b/>
-          <w:bCs/>
-          <w:sz w:val="32"/>
-          <w:szCs w:val="32"/>
-        </w:rPr>
-        <w:t xml:space="preserve">4) </w:t>
-      </w:r>
-      <w:r>
-        <w:rPr>
-          <w:rFonts w:ascii="TH SarabunPSK" w:hAnsi="TH SarabunPSK" w:cs="TH SarabunPSK"/>
-          <w:b/>
-          <w:bCs/>
-          <w:sz w:val="32"/>
-          <w:szCs w:val="32"/>
-          <w:cs/>
-        </w:rPr>
-        <w:t>การติดตั้งและเข้าถึง:</w:t>
-      </w:r>
-      <w:r>
-        <w:rPr>
-          <w:rFonts w:ascii="TH SarabunPSK" w:hAnsi="TH SarabunPSK" w:cs="TH SarabunPSK"/>
-          <w:sz w:val="32"/>
-          <w:szCs w:val="32"/>
-        </w:rPr>
-        <w:t> </w:t>
-      </w:r>
-      <w:r>
-        <w:rPr>
-          <w:rFonts w:ascii="TH SarabunPSK" w:hAnsi="TH SarabunPSK" w:cs="TH SarabunPSK"/>
-          <w:sz w:val="32"/>
-          <w:szCs w:val="32"/>
-          <w:cs/>
-        </w:rPr>
         <w:t>ผู้ใช้สามารถเข้าผ่าน</w:t>
       </w:r>
       <w:r>
@@ -6820,7 +7492,7 @@
         </w:rPr>
         <w:t>URL </w:t>
       </w:r>
-      <w:hyperlink r:id="rId7" w:tgtFrame="_blank" w:history="1">
+      <w:hyperlink r:id="rId12" w:tgtFrame="_blank" w:history="1">
         <w:r>
           <w:rPr>
             <w:rStyle w:val="Hyperlink"/>
@@ -7529,8 +8201,159 @@
           <w:szCs w:val="32"/>
           <w:cs/>
         </w:rPr>
+        <w:t xml:space="preserve">ปรับปรุงระบบอย่างต่อเนื่องตามข้อเสนอแนะ </w:t>
+      </w:r>
+    </w:p>
+    <w:p>
+      <w:pPr>
+        <w:pStyle w:val="NoSpacing"/>
+        <w:rPr>
+          <w:rFonts w:ascii="TH SarabunPSK" w:hAnsi="TH SarabunPSK" w:cs="TH SarabunPSK"/>
+          <w:sz w:val="32"/>
+          <w:szCs w:val="32"/>
+        </w:rPr>
+      </w:pPr>
+      <w:r>
+        <w:rPr>
+          <w:rFonts w:ascii="TH SarabunPSK" w:hAnsi="TH SarabunPSK" w:cs="TH SarabunPSK"/>
+          <w:sz w:val="32"/>
+          <w:szCs w:val="32"/>
+          <w:cs/>
+        </w:rPr>
+        <w:tab/>
+      </w:r>
+    </w:p>
+    <w:p>
+      <w:pPr>
+        <w:pStyle w:val="NoSpacing"/>
+        <w:rPr>
+          <w:rFonts w:ascii="TH SarabunPSK" w:hAnsi="TH SarabunPSK" w:cs="TH SarabunPSK"/>
+          <w:b/>
+          <w:bCs/>
+          <w:sz w:val="32"/>
+          <w:szCs w:val="32"/>
+        </w:rPr>
+      </w:pPr>
+      <w:r>
+        <w:rPr>
+          <w:rFonts w:ascii="TH SarabunPSK" w:hAnsi="TH SarabunPSK" w:cs="TH SarabunPSK" w:hint="cs"/>
+          <w:b/>
+          <w:bCs/>
+          <w:sz w:val="32"/>
+          <w:szCs w:val="32"/>
+          <w:cs/>
+        </w:rPr>
+        <w:t xml:space="preserve">ส่วนที่ </w:t>
+      </w:r>
+      <w:r>
+        <w:rPr>
+          <w:rFonts w:ascii="TH SarabunPSK" w:hAnsi="TH SarabunPSK" w:cs="TH SarabunPSK"/>
+          <w:b/>
+          <w:bCs/>
+          <w:sz w:val="32"/>
+          <w:szCs w:val="32"/>
+        </w:rPr>
+        <w:t xml:space="preserve">5 </w:t>
+      </w:r>
+      <w:r>
+        <w:rPr>
+          <w:rFonts w:ascii="TH SarabunPSK" w:hAnsi="TH SarabunPSK" w:cs="TH SarabunPSK" w:hint="cs"/>
+          <w:b/>
+          <w:bCs/>
+          <w:sz w:val="32"/>
+          <w:szCs w:val="32"/>
+          <w:cs/>
+        </w:rPr>
+        <w:t>ผลที่เกิดขึ้นกับผู้เรียน</w:t>
+      </w:r>
+    </w:p>
+    <w:p>
+      <w:pPr>
+        <w:pStyle w:val="NoSpacing"/>
+        <w:rPr>
+          <w:rFonts w:ascii="TH SarabunPSK" w:hAnsi="TH SarabunPSK" w:cs="TH SarabunPSK"/>
+          <w:b/>
+          <w:bCs/>
+          <w:sz w:val="32"/>
+          <w:szCs w:val="32"/>
+        </w:rPr>
+      </w:pPr>
+      <w:r>
+        <w:rPr>
+          <w:rFonts w:ascii="TH SarabunPSK" w:hAnsi="TH SarabunPSK" w:cs="TH SarabunPSK"/>
+          <w:sz w:val="32"/>
+          <w:szCs w:val="32"/>
+          <w:cs/>
+        </w:rPr>
+        <w:tab/>
+      </w:r>
+      <w:r>
+        <w:rPr>
+          <w:rFonts w:ascii="TH SarabunPSK" w:hAnsi="TH SarabunPSK" w:cs="TH SarabunPSK"/>
+          <w:b/>
+          <w:bCs/>
+          <w:sz w:val="32"/>
+          <w:szCs w:val="32"/>
+        </w:rPr>
+        <w:t xml:space="preserve">1. </w:t>
+      </w:r>
+      <w:r>
+        <w:rPr>
+          <w:rFonts w:ascii="TH SarabunPSK" w:hAnsi="TH SarabunPSK" w:cs="TH SarabunPSK" w:hint="cs"/>
+          <w:b/>
+          <w:bCs/>
+          <w:sz w:val="32"/>
+          <w:szCs w:val="32"/>
+          <w:cs/>
+        </w:rPr>
+        <w:t>ผลลัพธ์ที่เกิดการเรียนรู้ของผู้เรียน</w:t>
+      </w:r>
+    </w:p>
+    <w:p>
+      <w:pPr>
+        <w:pStyle w:val="NoSpacing"/>
+        <w:ind w:left="720" w:firstLine="720"/>
+        <w:rPr>
+          <w:rFonts w:ascii="TH SarabunPSK" w:hAnsi="TH SarabunPSK" w:cs="TH SarabunPSK"/>
+          <w:sz w:val="32"/>
+          <w:szCs w:val="32"/>
+        </w:rPr>
+      </w:pPr>
+      <w:r>
+        <w:rPr>
+          <w:rFonts w:ascii="TH SarabunPSK" w:hAnsi="TH SarabunPSK" w:cs="TH SarabunPSK"/>
+          <w:sz w:val="32"/>
+          <w:szCs w:val="32"/>
+          <w:cs/>
+        </w:rPr>
         <w:lastRenderedPageBreak/>
-        <w:t xml:space="preserve">ปรับปรุงระบบอย่างต่อเนื่องตามข้อเสนอแนะ </w:t>
+        <w:t>จากการนำนวัตกรรมไปใช้จริงตลอดภาคเรียน ผู้เรียนได้พัฒนาทักษะและองค์ความรู้ครอบคลุม</w:t>
+      </w:r>
+      <w:r>
+        <w:rPr>
+          <w:rFonts w:ascii="TH SarabunPSK" w:hAnsi="TH SarabunPSK" w:cs="TH SarabunPSK"/>
+          <w:sz w:val="32"/>
+          <w:szCs w:val="32"/>
+        </w:rPr>
+        <w:t xml:space="preserve"> 3 </w:t>
+      </w:r>
+      <w:r>
+        <w:rPr>
+          <w:rFonts w:ascii="TH SarabunPSK" w:hAnsi="TH SarabunPSK" w:cs="TH SarabunPSK"/>
+          <w:sz w:val="32"/>
+          <w:szCs w:val="32"/>
+          <w:cs/>
+        </w:rPr>
+        <w:t>ด้านสำคัญ ดังนี้</w:t>
+      </w:r>
+      <w:r>
+        <w:rPr>
+          <w:rFonts w:ascii="TH SarabunPSK" w:hAnsi="TH SarabunPSK" w:cs="TH SarabunPSK"/>
+          <w:sz w:val="32"/>
+          <w:szCs w:val="32"/>
+          <w:cs/>
+        </w:rPr>
+        <w:tab/>
       </w:r>
     </w:p>
     <w:p>
@@ -7539,418 +8362,12 @@
         <w:ind w:left="1440" w:firstLine="720"/>
         <w:rPr>
           <w:rFonts w:ascii="TH SarabunPSK" w:hAnsi="TH SarabunPSK" w:cs="TH SarabunPSK"/>
-          <w:sz w:val="32"/>
-          <w:szCs w:val="32"/>
-        </w:rPr>
-      </w:pPr>
-      <w:r>
-        <w:rPr>
-          <w:rFonts w:ascii="TH SarabunPSK" w:hAnsi="TH SarabunPSK" w:cs="TH SarabunPSK"/>
-          <w:sz w:val="32"/>
-          <w:szCs w:val="32"/>
-          <w:cs/>
-        </w:rPr>
-        <w:t>สถิติการใช้งานจริง (ข้อมูล ณ ปัจจุบัน):</w:t>
-      </w:r>
-    </w:p>
-    <w:p>
-      <w:pPr>
-        <w:pStyle w:val="NoSpacing"/>
-        <w:numPr>
-          <w:ilvl w:val="0"/>
-          <w:numId w:val="11"/>
-        </w:numPr>
-        <w:rPr>
-          <w:rFonts w:ascii="TH SarabunPSK" w:hAnsi="TH SarabunPSK" w:cs="TH SarabunPSK"/>
-          <w:sz w:val="32"/>
-          <w:szCs w:val="32"/>
-        </w:rPr>
-      </w:pPr>
-      <w:r>
-        <w:rPr>
-          <w:rFonts w:ascii="TH SarabunPSK" w:hAnsi="TH SarabunPSK" w:cs="TH SarabunPSK"/>
-          <w:sz w:val="32"/>
-          <w:szCs w:val="32"/>
-          <w:cs/>
-        </w:rPr>
-        <w:t xml:space="preserve">จำนวนวันใช้งาน: มากกว่า </w:t>
-      </w:r>
-      <w:r>
-        <w:rPr>
-          <w:rFonts w:ascii="TH SarabunPSK" w:hAnsi="TH SarabunPSK" w:cs="TH SarabunPSK"/>
-          <w:sz w:val="32"/>
-          <w:szCs w:val="32"/>
-        </w:rPr>
-        <w:t xml:space="preserve">30 </w:t>
-      </w:r>
-      <w:r>
-        <w:rPr>
-          <w:rFonts w:ascii="TH SarabunPSK" w:hAnsi="TH SarabunPSK" w:cs="TH SarabunPSK"/>
-          <w:sz w:val="32"/>
-          <w:szCs w:val="32"/>
-          <w:cs/>
-        </w:rPr>
-        <w:t>วันทำการ</w:t>
-      </w:r>
-    </w:p>
-    <w:p>
-      <w:pPr>
-        <w:pStyle w:val="NoSpacing"/>
-        <w:numPr>
-          <w:ilvl w:val="0"/>
-          <w:numId w:val="11"/>
-        </w:numPr>
-        <w:rPr>
-          <w:rFonts w:ascii="TH SarabunPSK" w:hAnsi="TH SarabunPSK" w:cs="TH SarabunPSK"/>
-          <w:sz w:val="32"/>
-          <w:szCs w:val="32"/>
-        </w:rPr>
-      </w:pPr>
-      <w:r>
-        <w:rPr>
-          <w:rFonts w:ascii="TH SarabunPSK" w:hAnsi="TH SarabunPSK" w:cs="TH SarabunPSK"/>
-          <w:sz w:val="32"/>
-          <w:szCs w:val="32"/>
-          <w:cs/>
-        </w:rPr>
-        <w:t xml:space="preserve">จำนวนผู้ใช้: </w:t>
-      </w:r>
-      <w:r>
-        <w:rPr>
-          <w:rFonts w:ascii="TH SarabunPSK" w:hAnsi="TH SarabunPSK" w:cs="TH SarabunPSK"/>
-          <w:sz w:val="32"/>
-          <w:szCs w:val="32"/>
-        </w:rPr>
-        <w:t xml:space="preserve">9 </w:t>
-      </w:r>
-      <w:r>
-        <w:rPr>
-          <w:rFonts w:ascii="TH SarabunPSK" w:hAnsi="TH SarabunPSK" w:cs="TH SarabunPSK"/>
-          <w:sz w:val="32"/>
-          <w:szCs w:val="32"/>
-          <w:cs/>
-        </w:rPr>
-        <w:t xml:space="preserve">คน (ครู </w:t>
-      </w:r>
-      <w:r>
-        <w:rPr>
-          <w:rFonts w:ascii="TH SarabunPSK" w:hAnsi="TH SarabunPSK" w:cs="TH SarabunPSK"/>
-          <w:sz w:val="32"/>
-          <w:szCs w:val="32"/>
-        </w:rPr>
-        <w:t xml:space="preserve">1 </w:t>
-      </w:r>
-      <w:r>
-        <w:rPr>
-          <w:rFonts w:ascii="TH SarabunPSK" w:hAnsi="TH SarabunPSK" w:cs="TH SarabunPSK"/>
-          <w:sz w:val="32"/>
-          <w:szCs w:val="32"/>
-          <w:cs/>
-        </w:rPr>
-        <w:t xml:space="preserve">คน นักเรียนสมาชิก </w:t>
-      </w:r>
-      <w:r>
-        <w:rPr>
-          <w:rFonts w:ascii="TH SarabunPSK" w:hAnsi="TH SarabunPSK" w:cs="TH SarabunPSK"/>
-          <w:sz w:val="32"/>
-          <w:szCs w:val="32"/>
-        </w:rPr>
-        <w:t xml:space="preserve">8 </w:t>
-      </w:r>
-      <w:r>
-        <w:rPr>
-          <w:rFonts w:ascii="TH SarabunPSK" w:hAnsi="TH SarabunPSK" w:cs="TH SarabunPSK"/>
-          <w:sz w:val="32"/>
-          <w:szCs w:val="32"/>
-          <w:cs/>
-        </w:rPr>
-        <w:t>คน)</w:t>
-      </w:r>
-    </w:p>
-    <w:p>
-      <w:pPr>
-        <w:pStyle w:val="NoSpacing"/>
-        <w:numPr>
-          <w:ilvl w:val="0"/>
-          <w:numId w:val="11"/>
-        </w:numPr>
-        <w:rPr>
-          <w:rFonts w:ascii="TH SarabunPSK" w:hAnsi="TH SarabunPSK" w:cs="TH SarabunPSK"/>
-          <w:sz w:val="32"/>
-          <w:szCs w:val="32"/>
-        </w:rPr>
-      </w:pPr>
-      <w:r>
-        <w:rPr>
-          <w:rFonts w:ascii="TH SarabunPSK" w:hAnsi="TH SarabunPSK" w:cs="TH SarabunPSK"/>
-          <w:sz w:val="32"/>
-          <w:szCs w:val="32"/>
-          <w:cs/>
-        </w:rPr>
-        <w:t>จำนวนการขายที่บันทึก: หลายร้อยรายการ</w:t>
-      </w:r>
-    </w:p>
-    <w:p>
-      <w:pPr>
-        <w:pStyle w:val="NoSpacing"/>
-        <w:numPr>
-          <w:ilvl w:val="0"/>
-          <w:numId w:val="11"/>
-        </w:numPr>
-        <w:rPr>
-          <w:rFonts w:ascii="TH SarabunPSK" w:hAnsi="TH SarabunPSK" w:cs="TH SarabunPSK"/>
-          <w:sz w:val="32"/>
-          <w:szCs w:val="32"/>
-        </w:rPr>
-      </w:pPr>
-      <w:r>
-        <w:rPr>
-          <w:rFonts w:ascii="TH SarabunPSK" w:hAnsi="TH SarabunPSK" w:cs="TH SarabunPSK"/>
-          <w:sz w:val="32"/>
-          <w:szCs w:val="32"/>
-          <w:cs/>
-        </w:rPr>
-        <w:t xml:space="preserve">จำนวนสินค้าในระบบ: มากกว่า </w:t>
-      </w:r>
-      <w:r>
-        <w:rPr>
-          <w:rFonts w:ascii="TH SarabunPSK" w:hAnsi="TH SarabunPSK" w:cs="TH SarabunPSK"/>
-          <w:sz w:val="32"/>
-          <w:szCs w:val="32"/>
-        </w:rPr>
-        <w:t xml:space="preserve">20 </w:t>
-      </w:r>
-      <w:r>
-        <w:rPr>
-          <w:rFonts w:ascii="TH SarabunPSK" w:hAnsi="TH SarabunPSK" w:cs="TH SarabunPSK"/>
-          <w:sz w:val="32"/>
-          <w:szCs w:val="32"/>
-          <w:cs/>
-        </w:rPr>
-        <w:t xml:space="preserve">รายการ ใน </w:t>
-      </w:r>
-      <w:r>
-        <w:rPr>
-          <w:rFonts w:ascii="TH SarabunPSK" w:hAnsi="TH SarabunPSK" w:cs="TH SarabunPSK"/>
-          <w:sz w:val="32"/>
-          <w:szCs w:val="32"/>
-        </w:rPr>
-        <w:t xml:space="preserve">6 </w:t>
-      </w:r>
-      <w:r>
-        <w:rPr>
-          <w:rFonts w:ascii="TH SarabunPSK" w:hAnsi="TH SarabunPSK" w:cs="TH SarabunPSK"/>
-          <w:sz w:val="32"/>
-          <w:szCs w:val="32"/>
-          <w:cs/>
-        </w:rPr>
-        <w:t>หมวดหมู่</w:t>
-      </w:r>
-    </w:p>
-    <w:p>
-      <w:pPr>
-        <w:pStyle w:val="NoSpacing"/>
-        <w:ind w:left="720" w:firstLine="720"/>
-        <w:rPr>
-          <w:rFonts w:ascii="TH SarabunPSK" w:hAnsi="TH SarabunPSK" w:cs="TH SarabunPSK"/>
-          <w:sz w:val="32"/>
-          <w:szCs w:val="32"/>
-        </w:rPr>
-      </w:pPr>
-      <w:r>
-        <w:rPr>
-          <w:rFonts w:ascii="TH SarabunPSK" w:hAnsi="TH SarabunPSK" w:cs="TH SarabunPSK"/>
-          <w:sz w:val="32"/>
-          <w:szCs w:val="32"/>
-          <w:cs/>
-        </w:rPr>
-        <w:t xml:space="preserve">นวัตกรรมจะดำเนินการใช้งานต่อเนื่องตลอดปีการศึกษา </w:t>
-      </w:r>
-      <w:r>
-        <w:rPr>
-          <w:rFonts w:ascii="TH SarabunPSK" w:hAnsi="TH SarabunPSK" w:cs="TH SarabunPSK"/>
-          <w:sz w:val="32"/>
-          <w:szCs w:val="32"/>
-        </w:rPr>
-        <w:t xml:space="preserve">2569 </w:t>
-      </w:r>
-      <w:r>
-        <w:rPr>
-          <w:rFonts w:ascii="TH SarabunPSK" w:hAnsi="TH SarabunPSK" w:cs="TH SarabunPSK"/>
-          <w:sz w:val="32"/>
-          <w:szCs w:val="32"/>
-          <w:cs/>
-        </w:rPr>
-        <w:t xml:space="preserve">และจะมีการประเมินผลแบบ </w:t>
-      </w:r>
-      <w:r>
-        <w:rPr>
-          <w:rFonts w:ascii="TH SarabunPSK" w:hAnsi="TH SarabunPSK" w:cs="TH SarabunPSK"/>
-          <w:sz w:val="32"/>
-          <w:szCs w:val="32"/>
-        </w:rPr>
-        <w:t xml:space="preserve">Pre-test / Post-test </w:t>
-      </w:r>
-      <w:r>
-        <w:rPr>
-          <w:rFonts w:ascii="TH SarabunPSK" w:hAnsi="TH SarabunPSK" w:cs="TH SarabunPSK"/>
-          <w:sz w:val="32"/>
-          <w:szCs w:val="32"/>
-          <w:cs/>
-        </w:rPr>
-        <w:t>ในวันปิดปีการศึกษาเพื่อวัดพัฒนาการของผู้เรียน</w:t>
-      </w:r>
-    </w:p>
-    <w:p>
-      <w:pPr>
-        <w:pStyle w:val="NoSpacing"/>
-        <w:rPr>
-          <w:rFonts w:ascii="TH SarabunPSK" w:hAnsi="TH SarabunPSK" w:cs="TH SarabunPSK"/>
-          <w:sz w:val="32"/>
-          <w:szCs w:val="32"/>
-        </w:rPr>
-      </w:pPr>
-      <w:r>
-        <w:rPr>
-          <w:rFonts w:ascii="TH SarabunPSK" w:hAnsi="TH SarabunPSK" w:cs="TH SarabunPSK"/>
-          <w:sz w:val="32"/>
-          <w:szCs w:val="32"/>
-          <w:cs/>
-        </w:rPr>
-        <w:tab/>
-      </w:r>
-    </w:p>
-    <w:p>
-      <w:pPr>
-        <w:pStyle w:val="NoSpacing"/>
-        <w:rPr>
-          <w:rFonts w:ascii="TH SarabunPSK" w:hAnsi="TH SarabunPSK" w:cs="TH SarabunPSK"/>
-          <w:b/>
-          <w:bCs/>
-          <w:sz w:val="32"/>
-          <w:szCs w:val="32"/>
-        </w:rPr>
-      </w:pPr>
-      <w:r>
-        <w:rPr>
-          <w:rFonts w:ascii="TH SarabunPSK" w:hAnsi="TH SarabunPSK" w:cs="TH SarabunPSK" w:hint="cs"/>
-          <w:b/>
-          <w:bCs/>
-          <w:sz w:val="32"/>
-          <w:szCs w:val="32"/>
-          <w:cs/>
-        </w:rPr>
-        <w:t xml:space="preserve">ส่วนที่ </w:t>
-      </w:r>
-      <w:r>
-        <w:rPr>
-          <w:rFonts w:ascii="TH SarabunPSK" w:hAnsi="TH SarabunPSK" w:cs="TH SarabunPSK"/>
-          <w:b/>
-          <w:bCs/>
-          <w:sz w:val="32"/>
-          <w:szCs w:val="32"/>
-        </w:rPr>
-        <w:t xml:space="preserve">5 </w:t>
-      </w:r>
-      <w:r>
-        <w:rPr>
-          <w:rFonts w:ascii="TH SarabunPSK" w:hAnsi="TH SarabunPSK" w:cs="TH SarabunPSK" w:hint="cs"/>
-          <w:b/>
-          <w:bCs/>
-          <w:sz w:val="32"/>
-          <w:szCs w:val="32"/>
-          <w:cs/>
-        </w:rPr>
-        <w:t>ผลที่เกิดขึ้นกับผู้เรียน</w:t>
-      </w:r>
-    </w:p>
-    <w:p>
-      <w:pPr>
-        <w:pStyle w:val="NoSpacing"/>
-        <w:rPr>
-          <w:rFonts w:ascii="TH SarabunPSK" w:hAnsi="TH SarabunPSK" w:cs="TH SarabunPSK"/>
-          <w:b/>
-          <w:bCs/>
-          <w:sz w:val="32"/>
-          <w:szCs w:val="32"/>
-        </w:rPr>
-      </w:pPr>
-      <w:r>
-        <w:rPr>
-          <w:rFonts w:ascii="TH SarabunPSK" w:hAnsi="TH SarabunPSK" w:cs="TH SarabunPSK"/>
-          <w:sz w:val="32"/>
-          <w:szCs w:val="32"/>
-          <w:cs/>
-        </w:rPr>
-        <w:tab/>
-      </w:r>
-      <w:r>
-        <w:rPr>
-          <w:rFonts w:ascii="TH SarabunPSK" w:hAnsi="TH SarabunPSK" w:cs="TH SarabunPSK"/>
-          <w:b/>
-          <w:bCs/>
-          <w:sz w:val="32"/>
-          <w:szCs w:val="32"/>
-        </w:rPr>
-        <w:t xml:space="preserve">1. </w:t>
-      </w:r>
-      <w:r>
-        <w:rPr>
-          <w:rFonts w:ascii="TH SarabunPSK" w:hAnsi="TH SarabunPSK" w:cs="TH SarabunPSK" w:hint="cs"/>
-          <w:b/>
-          <w:bCs/>
-          <w:sz w:val="32"/>
-          <w:szCs w:val="32"/>
-          <w:cs/>
-        </w:rPr>
-        <w:t>ผลลัพธ์ที่เกิดการเรียนรู้ของผู้เรียน</w:t>
-      </w:r>
-    </w:p>
-    <w:p>
-      <w:pPr>
-        <w:pStyle w:val="NoSpacing"/>
-        <w:ind w:left="720" w:firstLine="720"/>
-        <w:rPr>
-          <w:rFonts w:ascii="TH SarabunPSK" w:hAnsi="TH SarabunPSK" w:cs="TH SarabunPSK"/>
-          <w:sz w:val="32"/>
-          <w:szCs w:val="32"/>
-        </w:rPr>
-      </w:pPr>
-      <w:r>
-        <w:rPr>
-          <w:rFonts w:ascii="TH SarabunPSK" w:hAnsi="TH SarabunPSK" w:cs="TH SarabunPSK"/>
-          <w:sz w:val="32"/>
-          <w:szCs w:val="32"/>
-          <w:cs/>
-        </w:rPr>
-        <w:t>จากการนำนวัตกรรมไปใช้จริงตลอดภาคเรียน ผู้เรียนได้พัฒนาทักษะและองค์ความรู้ครอบคลุม</w:t>
-      </w:r>
-      <w:r>
-        <w:rPr>
-          <w:rFonts w:ascii="TH SarabunPSK" w:hAnsi="TH SarabunPSK" w:cs="TH SarabunPSK"/>
-          <w:sz w:val="32"/>
-          <w:szCs w:val="32"/>
-        </w:rPr>
-        <w:t xml:space="preserve"> 3 </w:t>
-      </w:r>
-      <w:r>
-        <w:rPr>
-          <w:rFonts w:ascii="TH SarabunPSK" w:hAnsi="TH SarabunPSK" w:cs="TH SarabunPSK"/>
-          <w:sz w:val="32"/>
-          <w:szCs w:val="32"/>
-          <w:cs/>
-        </w:rPr>
-        <w:t>ด้านสำคัญ ดังนี้</w:t>
-      </w:r>
-      <w:r>
-        <w:rPr>
-          <w:rFonts w:ascii="TH SarabunPSK" w:hAnsi="TH SarabunPSK" w:cs="TH SarabunPSK"/>
-          <w:sz w:val="32"/>
-          <w:szCs w:val="32"/>
-          <w:cs/>
-        </w:rPr>
-        <w:tab/>
-      </w:r>
+          <w:b/>
+          <w:bCs/>
+          <w:sz w:val="32"/>
+          <w:szCs w:val="32"/>
+        </w:rPr>
+      </w:pPr>
     </w:p>
     <w:p>
       <w:pPr>
@@ -7983,28 +8400,7 @@
           <w:szCs w:val="32"/>
           <w:cs/>
         </w:rPr>
-        <w:t>ด้านความรู้ (</w:t>
-      </w:r>
-      <w:r>
-        <w:rPr>
-          <w:rFonts w:ascii="TH SarabunPSK" w:hAnsi="TH SarabunPSK" w:cs="TH SarabunPSK"/>
-          <w:b/>
-          <w:bCs/>
-          <w:sz w:val="32"/>
-          <w:szCs w:val="32"/>
-        </w:rPr>
-        <w:t>Knowledge)</w:t>
-      </w:r>
-      <w:r>
-        <w:rPr>
-          <w:rFonts w:ascii="TH SarabunPSK" w:hAnsi="TH SarabunPSK" w:cs="TH SarabunPSK" w:hint="cs"/>
-          <w:b/>
-          <w:bCs/>
-          <w:sz w:val="32"/>
-          <w:szCs w:val="32"/>
-          <w:cs/>
-        </w:rPr>
-        <w:t xml:space="preserve"> </w:t>
+        <w:t xml:space="preserve">ด้านความรู้ </w:t>
       </w:r>
     </w:p>
     <w:p>
@@ -8140,7 +8536,7 @@
     <w:p>
       <w:pPr>
         <w:pStyle w:val="NoSpacing"/>
-        <w:ind w:left="720" w:firstLine="720"/>
+        <w:ind w:left="1440" w:firstLine="720"/>
         <w:rPr>
           <w:rFonts w:ascii="TH SarabunPSK" w:hAnsi="TH SarabunPSK" w:cs="TH SarabunPSK"/>
           <w:b/>
@@ -8168,17 +8564,7 @@
           <w:szCs w:val="32"/>
           <w:cs/>
         </w:rPr>
-        <w:t>ด้านทักษะ (</w:t>
-      </w:r>
-      <w:r>
-        <w:rPr>
-          <w:rFonts w:ascii="TH SarabunPSK" w:hAnsi="TH SarabunPSK" w:cs="TH SarabunPSK"/>
-          <w:b/>
-          <w:bCs/>
-          <w:sz w:val="32"/>
-          <w:szCs w:val="32"/>
-        </w:rPr>
-        <w:t>Skills)</w:t>
+        <w:t xml:space="preserve">ด้านทักษะ </w:t>
       </w:r>
     </w:p>
     <w:p>
@@ -8359,108 +8745,7 @@
     <w:p>
       <w:pPr>
         <w:pStyle w:val="NoSpacing"/>
-        <w:numPr>
-          <w:ilvl w:val="0"/>
-          <w:numId w:val="13"/>
-        </w:numPr>
-        <w:rPr>
-          <w:rFonts w:ascii="TH SarabunPSK" w:hAnsi="TH SarabunPSK" w:cs="TH SarabunPSK"/>
-          <w:sz w:val="32"/>
-          <w:szCs w:val="32"/>
-        </w:rPr>
-      </w:pPr>
-      <w:r>
-        <w:rPr>
-          <w:rFonts w:ascii="TH SarabunPSK" w:hAnsi="TH SarabunPSK" w:cs="TH SarabunPSK"/>
-          <w:sz w:val="32"/>
-          <w:szCs w:val="32"/>
-          <w:cs/>
-        </w:rPr>
-        <w:t>ทักษะการแก้ปัญหา</w:t>
-      </w:r>
-      <w:r>
-        <w:rPr>
-          <w:rFonts w:ascii="TH SarabunPSK" w:hAnsi="TH SarabunPSK" w:cs="TH SarabunPSK"/>
-          <w:sz w:val="32"/>
-          <w:szCs w:val="32"/>
-        </w:rPr>
-        <w:t> </w:t>
-      </w:r>
-      <w:r>
-        <w:rPr>
-          <w:rFonts w:ascii="TH SarabunPSK" w:hAnsi="TH SarabunPSK" w:cs="TH SarabunPSK"/>
-          <w:sz w:val="32"/>
-          <w:szCs w:val="32"/>
-          <w:cs/>
-        </w:rPr>
-        <w:t xml:space="preserve">เช่น การจัดการเมื่อสินค้าใกล้หมด การแก้ไขเมื่อขายผิด </w:t>
-      </w:r>
-    </w:p>
-    <w:p>
-      <w:pPr>
-        <w:pStyle w:val="NoSpacing"/>
-        <w:numPr>
-          <w:ilvl w:val="0"/>
-          <w:numId w:val="13"/>
-        </w:numPr>
-        <w:rPr>
-          <w:rFonts w:ascii="TH SarabunPSK" w:hAnsi="TH SarabunPSK" w:cs="TH SarabunPSK"/>
-          <w:sz w:val="32"/>
-          <w:szCs w:val="32"/>
-        </w:rPr>
-      </w:pPr>
-      <w:r>
-        <w:rPr>
-          <w:rFonts w:ascii="TH SarabunPSK" w:hAnsi="TH SarabunPSK" w:cs="TH SarabunPSK"/>
-          <w:sz w:val="32"/>
-          <w:szCs w:val="32"/>
-          <w:cs/>
-        </w:rPr>
-        <w:lastRenderedPageBreak/>
-        <w:t>ทักษะการคิดวิเคราะห์ข้อมูล</w:t>
-      </w:r>
-      <w:r>
-        <w:rPr>
-          <w:rFonts w:ascii="TH SarabunPSK" w:hAnsi="TH SarabunPSK" w:cs="TH SarabunPSK"/>
-          <w:sz w:val="32"/>
-          <w:szCs w:val="32"/>
-        </w:rPr>
-        <w:t> </w:t>
-      </w:r>
-      <w:r>
-        <w:rPr>
-          <w:rFonts w:ascii="TH SarabunPSK" w:hAnsi="TH SarabunPSK" w:cs="TH SarabunPSK"/>
-          <w:sz w:val="32"/>
-          <w:szCs w:val="32"/>
-          <w:cs/>
-        </w:rPr>
-        <w:t>ผ่านการอ่านและตีความกราฟวิเคราะห์ยอดขายใน</w:t>
-      </w:r>
-      <w:proofErr w:type="spellStart"/>
-      <w:r>
-        <w:rPr>
-          <w:rFonts w:ascii="TH SarabunPSK" w:hAnsi="TH SarabunPSK" w:cs="TH SarabunPSK"/>
-          <w:sz w:val="32"/>
-          <w:szCs w:val="32"/>
-          <w:cs/>
-        </w:rPr>
-        <w:t>แดช</w:t>
-      </w:r>
-      <w:proofErr w:type="spellEnd"/>
-      <w:r>
-        <w:rPr>
-          <w:rFonts w:ascii="TH SarabunPSK" w:hAnsi="TH SarabunPSK" w:cs="TH SarabunPSK"/>
-          <w:sz w:val="32"/>
-          <w:szCs w:val="32"/>
-          <w:cs/>
-        </w:rPr>
-        <w:t>บอร์ด</w:t>
-      </w:r>
-    </w:p>
-    <w:p>
-      <w:pPr>
-        <w:pStyle w:val="NoSpacing"/>
-        <w:ind w:left="720" w:firstLine="720"/>
+        <w:ind w:left="1440" w:firstLine="720"/>
         <w:rPr>
           <w:rFonts w:ascii="TH SarabunPSK" w:hAnsi="TH SarabunPSK" w:cs="TH SarabunPSK"/>
           <w:b/>
@@ -8488,17 +8773,7 @@
           <w:szCs w:val="32"/>
           <w:cs/>
         </w:rPr>
-        <w:t>ด้านคุณลักษณะ (</w:t>
-      </w:r>
-      <w:r>
-        <w:rPr>
-          <w:rFonts w:ascii="TH SarabunPSK" w:hAnsi="TH SarabunPSK" w:cs="TH SarabunPSK"/>
-          <w:b/>
-          <w:bCs/>
-          <w:sz w:val="32"/>
-          <w:szCs w:val="32"/>
-        </w:rPr>
-        <w:t>Attitudes / Attributes)</w:t>
+        <w:t xml:space="preserve">ด้านคุณลักษณะ </w:t>
       </w:r>
     </w:p>
     <w:p>
@@ -8661,35 +8936,65 @@
     <w:p>
       <w:pPr>
         <w:pStyle w:val="NoSpacing"/>
-        <w:rPr>
-          <w:rFonts w:ascii="TH SarabunPSK" w:hAnsi="TH SarabunPSK" w:cs="TH SarabunPSK"/>
-          <w:sz w:val="32"/>
-          <w:szCs w:val="32"/>
-        </w:rPr>
-      </w:pPr>
-      <w:r>
-        <w:rPr>
-          <w:rFonts w:ascii="TH SarabunPSK" w:hAnsi="TH SarabunPSK" w:cs="TH SarabunPSK"/>
-          <w:sz w:val="32"/>
-          <w:szCs w:val="32"/>
-        </w:rPr>
-        <w:t>……………………………………………………………………………………………………………………………………………………………………………………………………………………………………………………………………………………………………………………………………………………………………………………………………………………………………………………………………………………</w:t>
-      </w:r>
-      <w:r>
-        <w:rPr>
-          <w:rFonts w:ascii="TH SarabunPSK" w:hAnsi="TH SarabunPSK" w:cs="TH SarabunPSK" w:hint="cs"/>
-          <w:sz w:val="32"/>
-          <w:szCs w:val="32"/>
-          <w:cs/>
-        </w:rPr>
-        <w:t>....................</w:t>
-      </w:r>
-    </w:p>
-    <w:p>
-      <w:pPr>
-        <w:pStyle w:val="NoSpacing"/>
-        <w:rPr>
-          <w:rFonts w:ascii="TH SarabunPSK" w:hAnsi="TH SarabunPSK" w:cs="TH SarabunPSK"/>
+        <w:ind w:left="720" w:firstLine="720"/>
+        <w:rPr>
+          <w:rFonts w:ascii="TH SarabunPSK" w:hAnsi="TH SarabunPSK" w:cs="TH SarabunPSK"/>
+          <w:sz w:val="32"/>
+          <w:szCs w:val="32"/>
+        </w:rPr>
+      </w:pPr>
+      <w:r>
+        <w:rPr>
+          <w:rFonts w:ascii="TH SarabunPSK" w:hAnsi="TH SarabunPSK" w:cs="TH SarabunPSK"/>
+          <w:sz w:val="32"/>
+          <w:szCs w:val="32"/>
+        </w:rPr>
+        <w:t xml:space="preserve">1) </w:t>
+      </w:r>
+      <w:r>
+        <w:rPr>
+          <w:rFonts w:ascii="TH SarabunPSK" w:hAnsi="TH SarabunPSK" w:cs="TH SarabunPSK"/>
+          <w:sz w:val="32"/>
+          <w:szCs w:val="32"/>
+          <w:cs/>
+        </w:rPr>
+        <w:t>ควรเริ่มจากการศึกษาบริบทและความพร้อมของสถานศึกษา ทั้งในด้านอุปกรณ์ เทคโนโลยี และทักษะของผู้ใช้งาน เพื่อให้การนำไปใช้เกิดประสิทธิภาพสูงสุด ทั้งนี้ควรมีการเตรียมความพร้อมด้านโครงสร้างพื้นฐาน เช่น ระบบอินเทอร์เน็ต และอุปกรณ์ดิจิทัลที่เพียงพอ รวมถึงการอบรมครูและผู้เรียนให้มีความเข้าใจในการใช้งานระบบเบื้องต้น</w:t>
+      </w:r>
+    </w:p>
+    <w:p>
+      <w:pPr>
+        <w:pStyle w:val="NoSpacing"/>
+        <w:ind w:left="720" w:firstLine="720"/>
+        <w:rPr>
+          <w:rFonts w:ascii="TH SarabunPSK" w:hAnsi="TH SarabunPSK" w:cs="TH SarabunPSK"/>
+          <w:sz w:val="32"/>
+          <w:szCs w:val="32"/>
+        </w:rPr>
+      </w:pPr>
+      <w:r>
+        <w:rPr>
+          <w:rFonts w:ascii="TH SarabunPSK" w:hAnsi="TH SarabunPSK" w:cs="TH SarabunPSK"/>
+          <w:sz w:val="32"/>
+          <w:szCs w:val="32"/>
+        </w:rPr>
+        <w:lastRenderedPageBreak/>
+        <w:t xml:space="preserve">2) </w:t>
+      </w:r>
+      <w:r>
+        <w:rPr>
+          <w:rFonts w:ascii="TH SarabunPSK" w:hAnsi="TH SarabunPSK" w:cs="TH SarabunPSK"/>
+          <w:sz w:val="32"/>
+          <w:szCs w:val="32"/>
+          <w:cs/>
+        </w:rPr>
+        <w:t xml:space="preserve">ควรมีการปรับรูปแบบการใช้งานให้สอดคล้องกับบริบทของแต่ละโรงเรียน เช่น ขนาดของสหกรณ์ จำนวนผู้ใช้งาน หรือรูปแบบกิจกรรมการเรียนรู้ เพื่อให้สามารถนำไปใช้ได้อย่างเหมาะสมและเกิดประโยชน์สูงสุด </w:t>
+      </w:r>
+    </w:p>
+    <w:p>
+      <w:pPr>
+        <w:pStyle w:val="NoSpacing"/>
+        <w:rPr>
+          <w:rFonts w:ascii="TH SarabunPSK" w:hAnsi="TH SarabunPSK" w:cs="TH SarabunPSK" w:hint="cs"/>
           <w:sz w:val="32"/>
           <w:szCs w:val="32"/>
           <w:cs/>
@@ -8840,24 +9145,48 @@
     </w:p>
     <w:p>
       <w:pPr>
-        <w:pStyle w:val="NoSpacing"/>
-        <w:rPr>
-          <w:rFonts w:ascii="TH SarabunPSK" w:hAnsi="TH SarabunPSK" w:cs="TH SarabunPSK"/>
-          <w:b/>
-          <w:bCs/>
-          <w:sz w:val="32"/>
-          <w:szCs w:val="32"/>
-        </w:rPr>
-      </w:pPr>
-      <w:r>
-        <w:rPr>
-          <w:rFonts w:ascii="TH SarabunPSK" w:hAnsi="TH SarabunPSK" w:cs="TH SarabunPSK" w:hint="cs"/>
-          <w:b/>
-          <w:bCs/>
-          <w:sz w:val="32"/>
-          <w:szCs w:val="32"/>
-          <w:cs/>
-        </w:rPr>
+        <w:rPr>
+          <w:rFonts w:ascii="TH SarabunPSK" w:hAnsi="TH SarabunPSK" w:cs="TH SarabunPSK"/>
+          <w:b/>
+          <w:bCs/>
+          <w:sz w:val="32"/>
+          <w:szCs w:val="32"/>
+          <w:cs/>
+        </w:rPr>
+      </w:pPr>
+      <w:r>
+        <w:rPr>
+          <w:rFonts w:ascii="TH SarabunPSK" w:hAnsi="TH SarabunPSK" w:cs="TH SarabunPSK"/>
+          <w:b/>
+          <w:bCs/>
+          <w:sz w:val="32"/>
+          <w:szCs w:val="32"/>
+          <w:cs/>
+        </w:rPr>
+        <w:br w:type="page"/>
+      </w:r>
+    </w:p>
+    <w:p>
+      <w:pPr>
+        <w:pStyle w:val="NoSpacing"/>
+        <w:rPr>
+          <w:rFonts w:ascii="TH SarabunPSK" w:hAnsi="TH SarabunPSK" w:cs="TH SarabunPSK"/>
+          <w:b/>
+          <w:bCs/>
+          <w:sz w:val="32"/>
+          <w:szCs w:val="32"/>
+        </w:rPr>
+      </w:pPr>
+      <w:r>
+        <w:rPr>
+          <w:rFonts w:ascii="TH SarabunPSK" w:hAnsi="TH SarabunPSK" w:cs="TH SarabunPSK" w:hint="cs"/>
+          <w:b/>
+          <w:bCs/>
+          <w:sz w:val="32"/>
+          <w:szCs w:val="32"/>
+          <w:cs/>
+        </w:rPr>
+        <w:lastRenderedPageBreak/>
         <w:t xml:space="preserve">ส่วนที่ </w:t>
       </w:r>
       <w:r>
@@ -9257,6 +9586,7 @@
           <w:sz w:val="32"/>
           <w:szCs w:val="32"/>
         </w:rPr>
+        <w:lastRenderedPageBreak/>
         <w:tab/>
       </w:r>
       <w:r>
@@ -9713,7 +10043,6 @@
           <w:szCs w:val="32"/>
           <w:cs/>
         </w:rPr>
-        <w:lastRenderedPageBreak/>
         <w:tab/>
       </w:r>
       <w:r>
@@ -10351,7 +10680,7 @@
                     <pic:cNvPicPr/>
                   </pic:nvPicPr>
                   <pic:blipFill>
-                    <a:blip r:embed="rId8" cstate="print">
+                    <a:blip r:embed="rId13" cstate="print">
                       <a:extLst>
                         <a:ext uri="{28A0092B-C50C-407E-A947-70E740481C1C}">
                           <a14:useLocalDpi xmlns:a14="http://schemas.microsoft.com/office/drawing/2010/main" val="0"/>
@@ -12222,6 +12551,155 @@
     </w:lvl>
   </w:abstractNum>
   <w:abstractNum w:abstractNumId="13" w15:restartNumberingAfterBreak="0">
+    <w:nsid w:val="6DA93C13"/>
+    <w:multiLevelType w:val="multilevel"/>
+    <w:tmpl w:val="D4068A9A"/>
+    <w:lvl w:ilvl="0">
+      <w:start w:val="1"/>
+      <w:numFmt w:val="bullet"/>
+      <w:lvlText w:val=""/>
+      <w:lvlJc w:val="left"/>
+      <w:pPr>
+        <w:tabs>
+          <w:tab w:val="num" w:pos="1800"/>
+        </w:tabs>
+        <w:ind w:left="1800" w:hanging="360"/>
+      </w:pPr>
+      <w:rPr>
+        <w:rFonts w:ascii="Symbol" w:hAnsi="Symbol" w:hint="default"/>
+        <w:sz w:val="20"/>
+      </w:rPr>
+    </w:lvl>
+    <w:lvl w:ilvl="1" w:tentative="1">
+      <w:start w:val="1"/>
+      <w:numFmt w:val="bullet"/>
+      <w:lvlText w:val=""/>
+      <w:lvlJc w:val="left"/>
+      <w:pPr>
+        <w:tabs>
+          <w:tab w:val="num" w:pos="2520"/>
+        </w:tabs>
+        <w:ind w:left="2520" w:hanging="360"/>
+      </w:pPr>
+      <w:rPr>
+        <w:rFonts w:ascii="Symbol" w:hAnsi="Symbol" w:hint="default"/>
+        <w:sz w:val="20"/>
+      </w:rPr>
+    </w:lvl>
+    <w:lvl w:ilvl="2" w:tentative="1">
+      <w:start w:val="1"/>
+      <w:numFmt w:val="bullet"/>
+      <w:lvlText w:val=""/>
+      <w:lvlJc w:val="left"/>
+      <w:pPr>
+        <w:tabs>
+          <w:tab w:val="num" w:pos="3240"/>
+        </w:tabs>
+        <w:ind w:left="3240" w:hanging="360"/>
+      </w:pPr>
+      <w:rPr>
+        <w:rFonts w:ascii="Symbol" w:hAnsi="Symbol" w:hint="default"/>
+        <w:sz w:val="20"/>
+      </w:rPr>
+    </w:lvl>
+    <w:lvl w:ilvl="3" w:tentative="1">
+      <w:start w:val="1"/>
+      <w:numFmt w:val="bullet"/>
+      <w:lvlText w:val=""/>
+      <w:lvlJc w:val="left"/>
+      <w:pPr>
+        <w:tabs>
+          <w:tab w:val="num" w:pos="3960"/>
+        </w:tabs>
+        <w:ind w:left="3960" w:hanging="360"/>
+      </w:pPr>
+      <w:rPr>
+        <w:rFonts w:ascii="Symbol" w:hAnsi="Symbol" w:hint="default"/>
+        <w:sz w:val="20"/>
+      </w:rPr>
+    </w:lvl>
+    <w:lvl w:ilvl="4" w:tentative="1">
+      <w:start w:val="1"/>
+      <w:numFmt w:val="bullet"/>
+      <w:lvlText w:val=""/>
+      <w:lvlJc w:val="left"/>
+      <w:pPr>
+        <w:tabs>
+          <w:tab w:val="num" w:pos="4680"/>
+        </w:tabs>
+        <w:ind w:left="4680" w:hanging="360"/>
+      </w:pPr>
+      <w:rPr>
+        <w:rFonts w:ascii="Symbol" w:hAnsi="Symbol" w:hint="default"/>
+        <w:sz w:val="20"/>
+      </w:rPr>
+    </w:lvl>
+    <w:lvl w:ilvl="5" w:tentative="1">
+      <w:start w:val="1"/>
+      <w:numFmt w:val="bullet"/>
+      <w:lvlText w:val=""/>
+      <w:lvlJc w:val="left"/>
+      <w:pPr>
+        <w:tabs>
+          <w:tab w:val="num" w:pos="5400"/>
+        </w:tabs>
+        <w:ind w:left="5400" w:hanging="360"/>
+      </w:pPr>
+      <w:rPr>
+        <w:rFonts w:ascii="Symbol" w:hAnsi="Symbol" w:hint="default"/>
+        <w:sz w:val="20"/>
+      </w:rPr>
+    </w:lvl>
+    <w:lvl w:ilvl="6" w:tentative="1">
+      <w:start w:val="1"/>
+      <w:numFmt w:val="bullet"/>
+      <w:lvlText w:val=""/>
+      <w:lvlJc w:val="left"/>
+      <w:pPr>
+        <w:tabs>
+          <w:tab w:val="num" w:pos="6120"/>
+        </w:tabs>
+        <w:ind w:left="6120" w:hanging="360"/>
+      </w:pPr>
+      <w:rPr>
+        <w:rFonts w:ascii="Symbol" w:hAnsi="Symbol" w:hint="default"/>
+        <w:sz w:val="20"/>
+      </w:rPr>
+    </w:lvl>
+    <w:lvl w:ilvl="7" w:tentative="1">
+      <w:start w:val="1"/>
+      <w:numFmt w:val="bullet"/>
+      <w:lvlText w:val=""/>
+      <w:lvlJc w:val="left"/>
+      <w:pPr>
+        <w:tabs>
+          <w:tab w:val="num" w:pos="6840"/>
+        </w:tabs>
+        <w:ind w:left="6840" w:hanging="360"/>
+      </w:pPr>
+      <w:rPr>
+        <w:rFonts w:ascii="Symbol" w:hAnsi="Symbol" w:hint="default"/>
+        <w:sz w:val="20"/>
+      </w:rPr>
+    </w:lvl>
+    <w:lvl w:ilvl="8" w:tentative="1">
+      <w:start w:val="1"/>
+      <w:numFmt w:val="bullet"/>
+      <w:lvlText w:val=""/>
+      <w:lvlJc w:val="left"/>
+      <w:pPr>
+        <w:tabs>
+          <w:tab w:val="num" w:pos="7560"/>
+        </w:tabs>
+        <w:ind w:left="7560" w:hanging="360"/>
+      </w:pPr>
+      <w:rPr>
+        <w:rFonts w:ascii="Symbol" w:hAnsi="Symbol" w:hint="default"/>
+        <w:sz w:val="20"/>
+      </w:rPr>
+    </w:lvl>
+  </w:abstractNum>
+  <w:abstractNum w:abstractNumId="14" w15:restartNumberingAfterBreak="0">
     <w:nsid w:val="7809441B"/>
     <w:multiLevelType w:val="multilevel"/>
     <w:tmpl w:val="01F0A3EC"/>
@@ -12377,7 +12855,7 @@
     <w:abstractNumId w:val="10"/>
   </w:num>
   <w:num w:numId="3" w16cid:durableId="21173595">
-    <w:abstractNumId w:val="13"/>
+    <w:abstractNumId w:val="14"/>
   </w:num>
   <w:num w:numId="4" w16cid:durableId="426392636">
     <w:abstractNumId w:val="6"/>
@@ -12411,6 +12889,9 @@
   </w:num>
   <w:num w:numId="14" w16cid:durableId="1022122851">
     <w:abstractNumId w:val="4"/>
+  </w:num>
+  <w:num w:numId="15" w16cid:durableId="1504511409">
+    <w:abstractNumId w:val="13"/>
   </w:num>
 </w:numbering>
 </file>

</xml_diff>